<commit_message>
Fill only the gray cells of the course template
The workbook now keeps every template formula and text untouched: only
the 102 gray input cells (Fluxo de Caixa B5:D29, F5:F29; VPL e TIR B5:B6)
are filled, with typed values. The month-by-month build moves to a
separate Memoria_de_Calculo_Precept.xlsx, and the form points to it.

Co-Authored-By: Claude Opus 5.5 <noreply@anthropic.com>
Claude-Session: https://claude.ai/code/session_016kLWp3PkVdryYcjkVkag3m
</commit_message>
<xml_diff>
--- a/precept-financeiro/Ficha_Levantamento_Financeiro_Precept.docx
+++ b/precept-financeiro/Ficha_Levantamento_Financeiro_Precept.docx
@@ -209,7 +209,7 @@
                 <w:sz w:val="17"/>
                 <w:szCs w:val="17"/>
               </w:rPr>
-              <w:t xml:space="preserve">3. Os números são os mesmos da planilha financeira: abas Premissas Precept e Projeção Mensal, que alimentam a aba Fluxo de Caixa.</w:t>
+              <w:t xml:space="preserve">3. Os números são os mesmos digitados nas células cinzas da planilha financeira. O cálculo mês a mês está no arquivo Memória de Cálculo (abas Premissas e Projeção Mensal).</w:t>
             </w:r>
           </w:p>
           <w:p>
@@ -6444,7 +6444,7 @@
                 <w:sz w:val="17"/>
                 <w:szCs w:val="17"/>
               </w:rPr>
-              <w:t xml:space="preserve">R$ 84.862,16</w:t>
+              <w:t xml:space="preserve">R$ 84.862,19</w:t>
             </w:r>
           </w:p>
         </w:tc>
@@ -7205,7 +7205,7 @@
           <w:sz w:val="17"/>
           <w:szCs w:val="17"/>
         </w:rPr>
-        <w:t xml:space="preserve">Conferido: calculada mês a mês na aba Projeção Mensal.</w:t>
+        <w:t xml:space="preserve">Conferido: calculada mês a mês (arquivo Memória de Cálculo, aba Projeção Mensal).</w:t>
       </w:r>
     </w:p>
     <w:p>

</xml_diff>

<commit_message>
Raise Scale price and year-2 Sprint volume
Scale goes from R$ 18.997 to R$ 29.997 (6x R$ 4.999,50) and the Sprint
is also sold outside the Core base in year 2 (54 instead of 27). VPL at
24% a.a. rises from R$ 84,9 mil to R$ 126,1 mil; break-even (month 6)
and runway (4 months) are unchanged. Workbook still only fills the gray
cells; the form and the calculation memo are regenerated from one model.

Co-Authored-By: Claude Opus 5.5 <noreply@anthropic.com>
Claude-Session: https://claude.ai/code/session_016kLWp3PkVdryYcjkVkag3m
</commit_message>
<xml_diff>
--- a/precept-financeiro/Ficha_Levantamento_Financeiro_Precept.docx
+++ b/precept-financeiro/Ficha_Levantamento_Financeiro_Precept.docx
@@ -904,7 +904,7 @@
                 <w:sz w:val="17"/>
                 <w:szCs w:val="17"/>
               </w:rPr>
-              <w:t xml:space="preserve">2,25</w:t>
+              <w:t xml:space="preserve">4,5</w:t>
             </w:r>
           </w:p>
         </w:tc>
@@ -937,7 +937,7 @@
                 <w:sz w:val="17"/>
                 <w:szCs w:val="17"/>
               </w:rPr>
-              <w:t xml:space="preserve">22.493,25</w:t>
+              <w:t xml:space="preserve">44.986,50</w:t>
             </w:r>
           </w:p>
         </w:tc>
@@ -970,7 +970,7 @@
                 <w:sz w:val="17"/>
                 <w:szCs w:val="17"/>
               </w:rPr>
-              <w:t xml:space="preserve">Preço do grupo. ~5% da base Core compra por mês (27 Sprints no ano 2)</w:t>
+              <w:t xml:space="preserve">Preço do grupo. Vendido para a base Core e também para escritórios de fora (54 Sprints no ano 2, 4 a 5 por mês)</w:t>
             </w:r>
           </w:p>
         </w:tc>
@@ -1007,7 +1007,7 @@
                 <w:sz w:val="17"/>
                 <w:szCs w:val="17"/>
               </w:rPr>
-              <w:t xml:space="preserve">Precept Scale – implementação (6 parcelas de R$ 3.166,17)</w:t>
+              <w:t xml:space="preserve">Precept Scale – implementação (6 parcelas de R$ 4.999,50)</w:t>
             </w:r>
           </w:p>
         </w:tc>
@@ -1040,7 +1040,7 @@
                 <w:sz w:val="17"/>
                 <w:szCs w:val="17"/>
               </w:rPr>
-              <w:t xml:space="preserve">3.166,17</w:t>
+              <w:t xml:space="preserve">4.999,50</w:t>
             </w:r>
           </w:p>
         </w:tc>
@@ -1106,7 +1106,7 @@
                 <w:sz w:val="17"/>
                 <w:szCs w:val="17"/>
               </w:rPr>
-              <w:t xml:space="preserve">16.886,22</w:t>
+              <w:t xml:space="preserve">26.664,00</w:t>
             </w:r>
           </w:p>
         </w:tc>
@@ -1139,7 +1139,7 @@
                 <w:sz w:val="17"/>
                 <w:szCs w:val="17"/>
               </w:rPr>
-              <w:t xml:space="preserve">Preço do grupo (R$ 18.997). 40% de quem faz o Sprint contrata o Scale</w:t>
+              <w:t xml:space="preserve">Preço proposto: R$ 29.997 (3× o Sprint; ~R$ 5 mil/mês). ~20% de quem faz o Sprint contrata (11 no ano 2)</w:t>
             </w:r>
           </w:p>
         </w:tc>
@@ -1286,7 +1286,7 @@
                 <w:sz w:val="17"/>
                 <w:szCs w:val="17"/>
               </w:rPr>
-              <w:t xml:space="preserve">93.244,47</w:t>
+              <w:t xml:space="preserve">125.515,50</w:t>
             </w:r>
           </w:p>
         </w:tc>
@@ -1341,7 +1341,7 @@
           <w:sz w:val="16"/>
           <w:szCs w:val="16"/>
         </w:rPr>
-        <w:t xml:space="preserve">Mês típico com 45 clientes Core ativos em média (27 no Essencial, 18 no Avançado), 2,25 Sprints vendidos e 5,33 parcelas de Scale recebidas por mês.</w:t>
+        <w:t xml:space="preserve">Mês típico com 45 clientes Core ativos em média (27 no Essencial, 18 no Avançado), 4,5 Sprints vendidos e 5,33 parcelas de Scale recebidas por mês.</w:t>
       </w:r>
     </w:p>
     <w:p>
@@ -1884,7 +1884,7 @@
                 <w:sz w:val="17"/>
                 <w:szCs w:val="17"/>
               </w:rPr>
-              <w:t xml:space="preserve">Simples Nacional, Anexo V: 17,1% a 18,9% da venda (média de 18,3%)</w:t>
+              <w:t xml:space="preserve">Simples Nacional, Anexo V: 17,2% a 19,3% da venda (média de 18,6%)</w:t>
             </w:r>
           </w:p>
         </w:tc>
@@ -1917,7 +1917,7 @@
                 <w:sz w:val="17"/>
                 <w:szCs w:val="17"/>
               </w:rPr>
-              <w:t xml:space="preserve">17.026,66</w:t>
+              <w:t xml:space="preserve">23.364,34</w:t>
             </w:r>
           </w:p>
         </w:tc>
@@ -2053,7 +2053,7 @@
                 <w:sz w:val="17"/>
                 <w:szCs w:val="17"/>
               </w:rPr>
-              <w:t xml:space="preserve">1.864,89</w:t>
+              <w:t xml:space="preserve">2.510,31</w:t>
             </w:r>
           </w:p>
         </w:tc>
@@ -2189,7 +2189,7 @@
                 <w:sz w:val="17"/>
                 <w:szCs w:val="17"/>
               </w:rPr>
-              <w:t xml:space="preserve">1.968,97</w:t>
+              <w:t xml:space="preserve">3.582,53</w:t>
             </w:r>
           </w:p>
         </w:tc>
@@ -2325,7 +2325,7 @@
                 <w:sz w:val="17"/>
                 <w:szCs w:val="17"/>
               </w:rPr>
-              <w:t xml:space="preserve">2.416,67</w:t>
+              <w:t xml:space="preserve">3.766,67</w:t>
             </w:r>
           </w:p>
         </w:tc>
@@ -2461,7 +2461,7 @@
                 <w:sz w:val="17"/>
                 <w:szCs w:val="17"/>
               </w:rPr>
-              <w:t xml:space="preserve">13.782,81</w:t>
+              <w:t xml:space="preserve">25.077,68</w:t>
             </w:r>
           </w:p>
         </w:tc>
@@ -2605,7 +2605,7 @@
                 <w:sz w:val="17"/>
                 <w:szCs w:val="17"/>
               </w:rPr>
-              <w:t xml:space="preserve">41.110,00</w:t>
+              <w:t xml:space="preserve">62.351,51</w:t>
             </w:r>
           </w:p>
         </w:tc>
@@ -2670,7 +2670,7 @@
           <w:sz w:val="19"/>
           <w:szCs w:val="19"/>
         </w:rPr>
-        <w:t xml:space="preserve">44,1 %</w:t>
+        <w:t xml:space="preserve">49,7%</w:t>
       </w:r>
     </w:p>
     <w:p>
@@ -2686,7 +2686,7 @@
           <w:sz w:val="16"/>
           <w:szCs w:val="16"/>
         </w:rPr>
-        <w:t xml:space="preserve">Esse % muda por fase, porque muda o mix (no Início quase tudo é Core, que tem custo variável menor) e a alíquota do Simples sobe com o faturamento: Início 37,2% · Crescimento 41,8% · Estabilidade 44,1%. A planilha calcula isso mês a mês.</w:t>
+        <w:t xml:space="preserve">Esse % muda por fase, porque muda o mix (no Início quase tudo é Core, que tem custo variável menor) e a alíquota do Simples sobe com o faturamento: Início 37,5% · Crescimento 43,2% · Estabilidade 49,7%. A planilha calcula isso mês a mês.</w:t>
       </w:r>
     </w:p>
     <w:p>
@@ -3126,7 +3126,7 @@
                 <w:sz w:val="17"/>
                 <w:szCs w:val="17"/>
               </w:rPr>
-              <w:t xml:space="preserve">19.581,34</w:t>
+              <w:t xml:space="preserve">26.358,26</w:t>
             </w:r>
           </w:p>
         </w:tc>
@@ -3159,7 +3159,7 @@
                 <w:sz w:val="17"/>
                 <w:szCs w:val="17"/>
               </w:rPr>
-              <w:t xml:space="preserve">7 sócios × 3% da receita bruta (21% no total), a partir do mês 4. Média de R$ 2.797 por sócio no ano 2</w:t>
+              <w:t xml:space="preserve">7 sócios × 3% da receita bruta (21% no total), a partir do mês 4. Média de R$ 3.765 por sócio no ano 2</w:t>
             </w:r>
           </w:p>
         </w:tc>
@@ -3955,7 +3955,7 @@
                 <w:sz w:val="17"/>
                 <w:szCs w:val="17"/>
               </w:rPr>
-              <w:t xml:space="preserve">31.581,34</w:t>
+              <w:t xml:space="preserve">38.358,26</w:t>
             </w:r>
           </w:p>
         </w:tc>
@@ -5605,7 +5605,7 @@
                 <w:sz w:val="17"/>
                 <w:szCs w:val="17"/>
               </w:rPr>
-              <w:t xml:space="preserve">17.496,19</w:t>
+              <w:t xml:space="preserve">17.801,75</w:t>
             </w:r>
           </w:p>
         </w:tc>
@@ -5638,7 +5638,7 @@
                 <w:sz w:val="17"/>
                 <w:szCs w:val="17"/>
               </w:rPr>
-              <w:t xml:space="preserve">6.505,65</w:t>
+              <w:t xml:space="preserve">6.681,34</w:t>
             </w:r>
           </w:p>
         </w:tc>
@@ -5671,7 +5671,7 @@
                 <w:sz w:val="17"/>
                 <w:szCs w:val="17"/>
               </w:rPr>
-              <w:t xml:space="preserve">14.878,20</w:t>
+              <w:t xml:space="preserve">14.942,36</w:t>
             </w:r>
           </w:p>
         </w:tc>
@@ -5807,7 +5807,7 @@
                 <w:sz w:val="17"/>
                 <w:szCs w:val="17"/>
               </w:rPr>
-              <w:t xml:space="preserve">50.642,06</w:t>
+              <w:t xml:space="preserve">54.919,83</w:t>
             </w:r>
           </w:p>
         </w:tc>
@@ -5840,7 +5840,7 @@
                 <w:sz w:val="17"/>
                 <w:szCs w:val="17"/>
               </w:rPr>
-              <w:t xml:space="preserve">21.163,10</w:t>
+              <w:t xml:space="preserve">23.711,39</w:t>
             </w:r>
           </w:p>
         </w:tc>
@@ -5873,7 +5873,7 @@
                 <w:sz w:val="17"/>
                 <w:szCs w:val="17"/>
               </w:rPr>
-              <w:t xml:space="preserve">22.634,83</w:t>
+              <w:t xml:space="preserve">23.533,16</w:t>
             </w:r>
           </w:p>
         </w:tc>
@@ -6009,7 +6009,7 @@
                 <w:sz w:val="17"/>
                 <w:szCs w:val="17"/>
               </w:rPr>
-              <w:t xml:space="preserve">93.244,47</w:t>
+              <w:t xml:space="preserve">125.515,50</w:t>
             </w:r>
           </w:p>
         </w:tc>
@@ -6042,7 +6042,7 @@
                 <w:sz w:val="17"/>
                 <w:szCs w:val="17"/>
               </w:rPr>
-              <w:t xml:space="preserve">41.110,00</w:t>
+              <w:t xml:space="preserve">62.351,51</w:t>
             </w:r>
           </w:p>
         </w:tc>
@@ -6075,7 +6075,7 @@
                 <w:sz w:val="17"/>
                 <w:szCs w:val="17"/>
               </w:rPr>
-              <w:t xml:space="preserve">31.581,34</w:t>
+              <w:t xml:space="preserve">38.358,26</w:t>
             </w:r>
           </w:p>
         </w:tc>
@@ -6140,7 +6140,7 @@
           <w:sz w:val="17"/>
           <w:szCs w:val="17"/>
         </w:rPr>
-        <w:t xml:space="preserve">Início (1–6): lançamento com clientes-piloto da lista de escritórios previdenciários da Grande SP. A base Core sobe de 4 para 16 clientes, o 1º Sprint sai no mês 4 e o 1º Scale no mês 6. Sem retirada até o mês 3, o break-even operacional chega no mês 6. Crescimento (7–12): indicações e parcerias com contadores levam a base de 19 para 31 clientes e dão ritmo à escada Core → Sprint → Scale. Estabilidade (13–24): a base vai de 34 a 56 clientes (~5% dos ~1.050 escritórios previdenciários da Grande SP), com ganho líquido de 2 clientes por mês e churn de ~3% ao mês.</w:t>
+        <w:t xml:space="preserve">Início (1–6): lançamento com clientes-piloto da lista de escritórios previdenciários da Grande SP. A base Core sobe de 4 para 16 clientes, o 1º Sprint sai no mês 4 e o 1º Scale no mês 6. Sem retirada até o mês 3, o break-even operacional chega no mês 6. Crescimento (7–12): indicações e parcerias com contadores levam a base de 19 para 31 clientes e dão ritmo à escada Core → Sprint → Scale. Estabilidade (13–24): a base vai de 34 a 56 clientes (~5% dos ~1.050 escritórios previdenciários da Grande SP), com ganho líquido de 2 clientes por mês e churn de ~3% ao mês. O Sprint passa a ser vendido também para escritórios fora da base (4 a 5 por mês).</w:t>
       </w:r>
     </w:p>
     <w:p>
@@ -6444,7 +6444,7 @@
                 <w:sz w:val="17"/>
                 <w:szCs w:val="17"/>
               </w:rPr>
-              <w:t xml:space="preserve">R$ 84.862,19</w:t>
+              <w:t xml:space="preserve">R$ 126.073,61</w:t>
             </w:r>
           </w:p>
         </w:tc>
@@ -6477,7 +6477,7 @@
                 <w:sz w:val="17"/>
                 <w:szCs w:val="17"/>
               </w:rPr>
-              <w:t xml:space="preserve">Viável: gera R$ 83 de valor para cada R$ 100 investidos</w:t>
+              <w:t xml:space="preserve">Viável: gera R$ 124 de valor para cada R$ 100 investidos</w:t>
             </w:r>
           </w:p>
         </w:tc>
@@ -6547,7 +6547,7 @@
                 <w:sz w:val="17"/>
                 <w:szCs w:val="17"/>
               </w:rPr>
-              <w:t xml:space="preserve">79,5% a.a.</w:t>
+              <w:t xml:space="preserve">104,8% a.a.</w:t>
             </w:r>
           </w:p>
         </w:tc>
@@ -6856,7 +6856,7 @@
                 <w:sz w:val="17"/>
                 <w:szCs w:val="17"/>
               </w:rPr>
-              <w:t xml:space="preserve">Mês 18 / mês 19</w:t>
+              <w:t xml:space="preserve">Mês 17 / mês 18</w:t>
             </w:r>
           </w:p>
         </w:tc>
@@ -7062,7 +7062,7 @@
                 <w:sz w:val="17"/>
                 <w:szCs w:val="17"/>
               </w:rPr>
-              <w:t xml:space="preserve">R$ 95,0 mil / 73,3 mil / 64,8 mil</w:t>
+              <w:t xml:space="preserve">R$ 138,3 mil / 112,2 mil / 102,1 mil</w:t>
             </w:r>
           </w:p>
         </w:tc>

</xml_diff>

<commit_message>
Make Core the base product and add extra licenses
Every Core subscription includes 5 licenses (1 master + 4 dependents)
and each extra license is R$ 300/month. Sprint buyers get 1 month of
Core and Scale buyers 3 months; out-of-base Sprint buyers then become
Core subscribers (79 clients by month 24). Partner pay is recalibrated
to 3.5% each so break-even stays at month 6. VPL at 24% a.a. goes to
R$ 167,9 mil, TIR 126%. Form, workbooks, planning document, pitch slides
10/11/12/16 and the calculation memo are all regenerated.

Co-Authored-By: Claude Opus 5.5 <noreply@anthropic.com>
Claude-Session: https://claude.ai/code/session_016kLWp3PkVdryYcjkVkag3m
</commit_message>
<xml_diff>
--- a/precept-financeiro/Ficha_Levantamento_Financeiro_Precept.docx
+++ b/precept-financeiro/Ficha_Levantamento_Financeiro_Precept.docx
@@ -500,7 +500,7 @@
                 <w:sz w:val="17"/>
                 <w:szCs w:val="17"/>
               </w:rPr>
-              <w:t xml:space="preserve">Precept Core – plano Essencial (assinatura mensal)</w:t>
+              <w:t xml:space="preserve">Precept Core – plano Essencial (assinatura mensal, 5 licenças)</w:t>
             </w:r>
           </w:p>
         </w:tc>
@@ -566,7 +566,7 @@
                 <w:sz w:val="17"/>
                 <w:szCs w:val="17"/>
               </w:rPr>
-              <w:t xml:space="preserve">27</w:t>
+              <w:t xml:space="preserve">30,25</w:t>
             </w:r>
           </w:p>
         </w:tc>
@@ -599,7 +599,7 @@
                 <w:sz w:val="17"/>
                 <w:szCs w:val="17"/>
               </w:rPr>
-              <w:t xml:space="preserve">26.919,00</w:t>
+              <w:t xml:space="preserve">30.159,25</w:t>
             </w:r>
           </w:p>
         </w:tc>
@@ -669,7 +669,7 @@
                 <w:sz w:val="17"/>
                 <w:szCs w:val="17"/>
               </w:rPr>
-              <w:t xml:space="preserve">Precept Core – plano Avançado (operações maiores)</w:t>
+              <w:t xml:space="preserve">Precept Core – plano Avançado (operações maiores, 5 licenças)</w:t>
             </w:r>
           </w:p>
         </w:tc>
@@ -735,7 +735,7 @@
                 <w:sz w:val="17"/>
                 <w:szCs w:val="17"/>
               </w:rPr>
-              <w:t xml:space="preserve">18</w:t>
+              <w:t xml:space="preserve">20,17</w:t>
             </w:r>
           </w:p>
         </w:tc>
@@ -768,7 +768,7 @@
                 <w:sz w:val="17"/>
                 <w:szCs w:val="17"/>
               </w:rPr>
-              <w:t xml:space="preserve">26.946,00</w:t>
+              <w:t xml:space="preserve">30.189,50</w:t>
             </w:r>
           </w:p>
         </w:tc>
@@ -801,7 +801,7 @@
                 <w:sz w:val="17"/>
                 <w:szCs w:val="17"/>
               </w:rPr>
-              <w:t xml:space="preserve">Faixa do pitch. Hipótese: 40% da base Core em escritórios maiores</w:t>
+              <w:t xml:space="preserve">Faixa do pitch. O preço segue o porte da operação; hipótese de 40% da base nesse plano</w:t>
             </w:r>
           </w:p>
         </w:tc>
@@ -838,7 +838,7 @@
                 <w:sz w:val="17"/>
                 <w:szCs w:val="17"/>
               </w:rPr>
-              <w:t xml:space="preserve">Precept Sprint – imersão estratégica e tática de 7 dias</w:t>
+              <w:t xml:space="preserve">Licenças extras (acima das 5 incluídas)</w:t>
             </w:r>
           </w:p>
         </w:tc>
@@ -871,7 +871,7 @@
                 <w:sz w:val="17"/>
                 <w:szCs w:val="17"/>
               </w:rPr>
-              <w:t xml:space="preserve">9.997,00</w:t>
+              <w:t xml:space="preserve">300,00</w:t>
             </w:r>
           </w:p>
         </w:tc>
@@ -904,7 +904,7 @@
                 <w:sz w:val="17"/>
                 <w:szCs w:val="17"/>
               </w:rPr>
-              <w:t xml:space="preserve">4,5</w:t>
+              <w:t xml:space="preserve">50,42</w:t>
             </w:r>
           </w:p>
         </w:tc>
@@ -937,7 +937,7 @@
                 <w:sz w:val="17"/>
                 <w:szCs w:val="17"/>
               </w:rPr>
-              <w:t xml:space="preserve">44.986,50</w:t>
+              <w:t xml:space="preserve">15.125,00</w:t>
             </w:r>
           </w:p>
         </w:tc>
@@ -970,7 +970,7 @@
                 <w:sz w:val="17"/>
                 <w:szCs w:val="17"/>
               </w:rPr>
-              <w:t xml:space="preserve">Preço do grupo. Vendido para a base Core e também para escritórios de fora (54 Sprints no ano 2, 4 a 5 por mês)</w:t>
+              <w:t xml:space="preserve">Decisão do grupo: R$ 300/mês por licença. Hipótese: 1 licença extra por cliente pagante, em média</w:t>
             </w:r>
           </w:p>
         </w:tc>
@@ -1007,7 +1007,7 @@
                 <w:sz w:val="17"/>
                 <w:szCs w:val="17"/>
               </w:rPr>
-              <w:t xml:space="preserve">Precept Scale – implementação (6 parcelas de R$ 4.999,50)</w:t>
+              <w:t xml:space="preserve">Precept Sprint – imersão estratégica e tática de 7 dias</w:t>
             </w:r>
           </w:p>
         </w:tc>
@@ -1040,7 +1040,7 @@
                 <w:sz w:val="17"/>
                 <w:szCs w:val="17"/>
               </w:rPr>
-              <w:t xml:space="preserve">4.999,50</w:t>
+              <w:t xml:space="preserve">9.997,00</w:t>
             </w:r>
           </w:p>
         </w:tc>
@@ -1073,7 +1073,7 @@
                 <w:sz w:val="17"/>
                 <w:szCs w:val="17"/>
               </w:rPr>
-              <w:t xml:space="preserve">5,33</w:t>
+              <w:t xml:space="preserve">4,5</w:t>
             </w:r>
           </w:p>
         </w:tc>
@@ -1106,7 +1106,7 @@
                 <w:sz w:val="17"/>
                 <w:szCs w:val="17"/>
               </w:rPr>
-              <w:t xml:space="preserve">26.664,00</w:t>
+              <w:t xml:space="preserve">44.986,50</w:t>
             </w:r>
           </w:p>
         </w:tc>
@@ -1139,7 +1139,7 @@
                 <w:sz w:val="17"/>
                 <w:szCs w:val="17"/>
               </w:rPr>
-              <w:t xml:space="preserve">Preço proposto: R$ 29.997 (3× o Sprint; ~R$ 5 mil/mês). ~20% de quem faz o Sprint contrata (11 no ano 2)</w:t>
+              <w:t xml:space="preserve">Preço do grupo. Vendido para a base Core e também para escritórios de fora (54 Sprints no ano 2, 4 a 5 por mês). Inclui 1 mês de Core</w:t>
             </w:r>
           </w:p>
         </w:tc>
@@ -1157,6 +1157,175 @@
               <w:bottom w:val="single" w:color="7F7F7F" w:sz="4"/>
               <w:right w:val="single" w:color="7F7F7F" w:sz="4"/>
             </w:tcBorders>
+            <w:tcMar>
+              <w:top w:type="dxa" w:w="50"/>
+              <w:left w:type="dxa" w:w="90"/>
+              <w:bottom w:type="dxa" w:w="50"/>
+              <w:right w:type="dxa" w:w="90"/>
+            </w:tcMar>
+            <w:vAlign w:val="center"/>
+          </w:tcPr>
+          <w:p>
+            <w:pPr>
+              <w:spacing w:after="0" w:before="0" w:line="240"/>
+              <w:jc w:val="left"/>
+            </w:pPr>
+            <w:r>
+              <w:rPr>
+                <w:rFonts w:ascii="Calibri" w:cs="Calibri" w:eastAsia="Calibri" w:hAnsi="Calibri"/>
+                <w:sz w:val="17"/>
+                <w:szCs w:val="17"/>
+              </w:rPr>
+              <w:t xml:space="preserve">Precept Scale – implementação (6 parcelas de R$ 4.999,50)</w:t>
+            </w:r>
+          </w:p>
+        </w:tc>
+        <w:tc>
+          <w:tcPr>
+            <w:tcW w:type="dxa" w:w="1300"/>
+            <w:tcBorders>
+              <w:top w:val="single" w:color="7F7F7F" w:sz="4"/>
+              <w:left w:val="single" w:color="7F7F7F" w:sz="4"/>
+              <w:bottom w:val="single" w:color="7F7F7F" w:sz="4"/>
+              <w:right w:val="single" w:color="7F7F7F" w:sz="4"/>
+            </w:tcBorders>
+            <w:tcMar>
+              <w:top w:type="dxa" w:w="50"/>
+              <w:left w:type="dxa" w:w="90"/>
+              <w:bottom w:type="dxa" w:w="50"/>
+              <w:right w:type="dxa" w:w="90"/>
+            </w:tcMar>
+            <w:vAlign w:val="center"/>
+          </w:tcPr>
+          <w:p>
+            <w:pPr>
+              <w:spacing w:after="0" w:before="0" w:line="240"/>
+              <w:jc w:val="right"/>
+            </w:pPr>
+            <w:r>
+              <w:rPr>
+                <w:rFonts w:ascii="Calibri" w:cs="Calibri" w:eastAsia="Calibri" w:hAnsi="Calibri"/>
+                <w:color w:val="1F3864"/>
+                <w:sz w:val="17"/>
+                <w:szCs w:val="17"/>
+              </w:rPr>
+              <w:t xml:space="preserve">4.999,50</w:t>
+            </w:r>
+          </w:p>
+        </w:tc>
+        <w:tc>
+          <w:tcPr>
+            <w:tcW w:type="dxa" w:w="1150"/>
+            <w:tcBorders>
+              <w:top w:val="single" w:color="7F7F7F" w:sz="4"/>
+              <w:left w:val="single" w:color="7F7F7F" w:sz="4"/>
+              <w:bottom w:val="single" w:color="7F7F7F" w:sz="4"/>
+              <w:right w:val="single" w:color="7F7F7F" w:sz="4"/>
+            </w:tcBorders>
+            <w:tcMar>
+              <w:top w:type="dxa" w:w="50"/>
+              <w:left w:type="dxa" w:w="90"/>
+              <w:bottom w:type="dxa" w:w="50"/>
+              <w:right w:type="dxa" w:w="90"/>
+            </w:tcMar>
+            <w:vAlign w:val="center"/>
+          </w:tcPr>
+          <w:p>
+            <w:pPr>
+              <w:spacing w:after="0" w:before="0" w:line="240"/>
+              <w:jc w:val="right"/>
+            </w:pPr>
+            <w:r>
+              <w:rPr>
+                <w:rFonts w:ascii="Calibri" w:cs="Calibri" w:eastAsia="Calibri" w:hAnsi="Calibri"/>
+                <w:color w:val="1F3864"/>
+                <w:sz w:val="17"/>
+                <w:szCs w:val="17"/>
+              </w:rPr>
+              <w:t xml:space="preserve">5,33</w:t>
+            </w:r>
+          </w:p>
+        </w:tc>
+        <w:tc>
+          <w:tcPr>
+            <w:tcW w:type="dxa" w:w="1500"/>
+            <w:tcBorders>
+              <w:top w:val="single" w:color="7F7F7F" w:sz="4"/>
+              <w:left w:val="single" w:color="7F7F7F" w:sz="4"/>
+              <w:bottom w:val="single" w:color="7F7F7F" w:sz="4"/>
+              <w:right w:val="single" w:color="7F7F7F" w:sz="4"/>
+            </w:tcBorders>
+            <w:tcMar>
+              <w:top w:type="dxa" w:w="50"/>
+              <w:left w:type="dxa" w:w="90"/>
+              <w:bottom w:type="dxa" w:w="50"/>
+              <w:right w:type="dxa" w:w="90"/>
+            </w:tcMar>
+            <w:vAlign w:val="center"/>
+          </w:tcPr>
+          <w:p>
+            <w:pPr>
+              <w:spacing w:after="0" w:before="0" w:line="240"/>
+              <w:jc w:val="right"/>
+            </w:pPr>
+            <w:r>
+              <w:rPr>
+                <w:rFonts w:ascii="Calibri" w:cs="Calibri" w:eastAsia="Calibri" w:hAnsi="Calibri"/>
+                <w:color w:val="1F3864"/>
+                <w:sz w:val="17"/>
+                <w:szCs w:val="17"/>
+              </w:rPr>
+              <w:t xml:space="preserve">26.664,00</w:t>
+            </w:r>
+          </w:p>
+        </w:tc>
+        <w:tc>
+          <w:tcPr>
+            <w:tcW w:type="dxa" w:w="3056"/>
+            <w:tcBorders>
+              <w:top w:val="single" w:color="7F7F7F" w:sz="4"/>
+              <w:left w:val="single" w:color="7F7F7F" w:sz="4"/>
+              <w:bottom w:val="single" w:color="7F7F7F" w:sz="4"/>
+              <w:right w:val="single" w:color="7F7F7F" w:sz="4"/>
+            </w:tcBorders>
+            <w:tcMar>
+              <w:top w:type="dxa" w:w="50"/>
+              <w:left w:type="dxa" w:w="90"/>
+              <w:bottom w:type="dxa" w:w="50"/>
+              <w:right w:type="dxa" w:w="90"/>
+            </w:tcMar>
+            <w:vAlign w:val="center"/>
+          </w:tcPr>
+          <w:p>
+            <w:pPr>
+              <w:spacing w:after="0" w:before="0" w:line="240"/>
+              <w:jc w:val="left"/>
+            </w:pPr>
+            <w:r>
+              <w:rPr>
+                <w:rFonts w:ascii="Calibri" w:cs="Calibri" w:eastAsia="Calibri" w:hAnsi="Calibri"/>
+                <w:color w:val="1F3864"/>
+                <w:sz w:val="17"/>
+                <w:szCs w:val="17"/>
+              </w:rPr>
+              <w:t xml:space="preserve">Preço proposto: R$ 29.997 (3× o Sprint). Inclui 3 meses de Core. ~20% de quem faz o Sprint contrata (11 no ano 2)</w:t>
+            </w:r>
+          </w:p>
+        </w:tc>
+      </w:tr>
+      <w:tr>
+        <w:trPr>
+          <w:cantSplit/>
+        </w:trPr>
+        <w:tc>
+          <w:tcPr>
+            <w:tcW w:type="dxa" w:w="2900"/>
+            <w:tcBorders>
+              <w:top w:val="single" w:color="7F7F7F" w:sz="4"/>
+              <w:left w:val="single" w:color="7F7F7F" w:sz="4"/>
+              <w:bottom w:val="single" w:color="7F7F7F" w:sz="4"/>
+              <w:right w:val="single" w:color="7F7F7F" w:sz="4"/>
+            </w:tcBorders>
             <w:shd w:fill="D6DCE5" w:color="auto" w:val="clear"/>
             <w:tcMar>
               <w:top w:type="dxa" w:w="50"/>
@@ -1286,7 +1455,7 @@
                 <w:sz w:val="17"/>
                 <w:szCs w:val="17"/>
               </w:rPr>
-              <w:t xml:space="preserve">125.515,50</w:t>
+              <w:t xml:space="preserve">147.124,25</w:t>
             </w:r>
           </w:p>
         </w:tc>
@@ -1341,7 +1510,7 @@
           <w:sz w:val="16"/>
           <w:szCs w:val="16"/>
         </w:rPr>
-        <w:t xml:space="preserve">Mês típico com 45 clientes Core ativos em média (27 no Essencial, 18 no Avançado), 4,5 Sprints vendidos e 5,33 parcelas de Scale recebidas por mês.</w:t>
+        <w:t xml:space="preserve">Mês típico com 57,7 clientes Core ativos em média, dos quais 50,4 pagantes (os demais estão no mês de Core grátis do Sprint ou do Scale), 4,5 Sprints vendidos e 5,33 parcelas de Scale recebidas por mês. Cada assinatura inclui 1 acesso master + 4 dependentes.</w:t>
       </w:r>
     </w:p>
     <w:p>
@@ -1612,7 +1781,7 @@
                 <w:sz w:val="17"/>
                 <w:szCs w:val="17"/>
               </w:rPr>
-              <w:t xml:space="preserve">R$ 90 por cliente Core ativo × 45</w:t>
+              <w:t xml:space="preserve">R$ 90 por cliente ativo (57,7) + R$ 18 por licença extra</w:t>
             </w:r>
           </w:p>
         </w:tc>
@@ -1645,7 +1814,7 @@
                 <w:sz w:val="17"/>
                 <w:szCs w:val="17"/>
               </w:rPr>
-              <w:t xml:space="preserve">4.050,00</w:t>
+              <w:t xml:space="preserve">6.228,00</w:t>
             </w:r>
           </w:p>
         </w:tc>
@@ -1884,7 +2053,7 @@
                 <w:sz w:val="17"/>
                 <w:szCs w:val="17"/>
               </w:rPr>
-              <w:t xml:space="preserve">Simples Nacional, Anexo V: 17,2% a 19,3% da venda (média de 18,6%)</w:t>
+              <w:t xml:space="preserve">Simples Nacional, Anexo V: 17,4% a 19,5% da venda (média de 18,8%)</w:t>
             </w:r>
           </w:p>
         </w:tc>
@@ -1917,7 +2086,7 @@
                 <w:sz w:val="17"/>
                 <w:szCs w:val="17"/>
               </w:rPr>
-              <w:t xml:space="preserve">23.364,34</w:t>
+              <w:t xml:space="preserve">27.649,61</w:t>
             </w:r>
           </w:p>
         </w:tc>
@@ -2053,7 +2222,7 @@
                 <w:sz w:val="17"/>
                 <w:szCs w:val="17"/>
               </w:rPr>
-              <w:t xml:space="preserve">2.510,31</w:t>
+              <w:t xml:space="preserve">2.942,49</w:t>
             </w:r>
           </w:p>
         </w:tc>
@@ -2605,7 +2774,7 @@
                 <w:sz w:val="17"/>
                 <w:szCs w:val="17"/>
               </w:rPr>
-              <w:t xml:space="preserve">62.351,51</w:t>
+              <w:t xml:space="preserve">69.246,96</w:t>
             </w:r>
           </w:p>
         </w:tc>
@@ -2670,7 +2839,7 @@
           <w:sz w:val="19"/>
           <w:szCs w:val="19"/>
         </w:rPr>
-        <w:t xml:space="preserve">49,7%</w:t>
+        <w:t xml:space="preserve">47,1%</w:t>
       </w:r>
     </w:p>
     <w:p>
@@ -2686,7 +2855,7 @@
           <w:sz w:val="16"/>
           <w:szCs w:val="16"/>
         </w:rPr>
-        <w:t xml:space="preserve">Esse % muda por fase, porque muda o mix (no Início quase tudo é Core, que tem custo variável menor) e a alíquota do Simples sobe com o faturamento: Início 37,5% · Crescimento 43,2% · Estabilidade 49,7%. A planilha calcula isso mês a mês.</w:t>
+        <w:t xml:space="preserve">Esse % muda por fase, porque muda o mix (no Início quase tudo é Core, que tem custo variável menor) e a alíquota do Simples sobe com o faturamento: Início 36,5% · Crescimento 42,7% · Estabilidade 47,1%. A planilha calcula isso mês a mês.</w:t>
       </w:r>
     </w:p>
     <w:p>
@@ -3126,7 +3295,7 @@
                 <w:sz w:val="17"/>
                 <w:szCs w:val="17"/>
               </w:rPr>
-              <w:t xml:space="preserve">26.358,26</w:t>
+              <w:t xml:space="preserve">36.045,44</w:t>
             </w:r>
           </w:p>
         </w:tc>
@@ -3159,7 +3328,7 @@
                 <w:sz w:val="17"/>
                 <w:szCs w:val="17"/>
               </w:rPr>
-              <w:t xml:space="preserve">7 sócios × 3% da receita bruta (21% no total), a partir do mês 4. Média de R$ 3.765 por sócio no ano 2</w:t>
+              <w:t xml:space="preserve">7 sócios × 3,5% da receita bruta (24,5% no total), a partir do mês 4. Média de R$ 5.149 por sócio no ano 2</w:t>
             </w:r>
           </w:p>
         </w:tc>
@@ -3955,7 +4124,7 @@
                 <w:sz w:val="17"/>
                 <w:szCs w:val="17"/>
               </w:rPr>
-              <w:t xml:space="preserve">38.358,26</w:t>
+              <w:t xml:space="preserve">48.045,44</w:t>
             </w:r>
           </w:p>
         </w:tc>
@@ -5605,7 +5774,7 @@
                 <w:sz w:val="17"/>
                 <w:szCs w:val="17"/>
               </w:rPr>
-              <w:t xml:space="preserve">17.801,75</w:t>
+              <w:t xml:space="preserve">19.803,75</w:t>
             </w:r>
           </w:p>
         </w:tc>
@@ -5638,7 +5807,7 @@
                 <w:sz w:val="17"/>
                 <w:szCs w:val="17"/>
               </w:rPr>
-              <w:t xml:space="preserve">6.681,34</w:t>
+              <w:t xml:space="preserve">7.225,91</w:t>
             </w:r>
           </w:p>
         </w:tc>
@@ -5671,7 +5840,7 @@
                 <w:sz w:val="17"/>
                 <w:szCs w:val="17"/>
               </w:rPr>
-              <w:t xml:space="preserve">14.942,36</w:t>
+              <w:t xml:space="preserve">15.690,50</w:t>
             </w:r>
           </w:p>
         </w:tc>
@@ -5807,7 +5976,7 @@
                 <w:sz w:val="17"/>
                 <w:szCs w:val="17"/>
               </w:rPr>
-              <w:t xml:space="preserve">54.919,83</w:t>
+              <w:t xml:space="preserve">58.178,33</w:t>
             </w:r>
           </w:p>
         </w:tc>
@@ -5840,7 +6009,7 @@
                 <w:sz w:val="17"/>
                 <w:szCs w:val="17"/>
               </w:rPr>
-              <w:t xml:space="preserve">23.711,39</w:t>
+              <w:t xml:space="preserve">24.858,76</w:t>
             </w:r>
           </w:p>
         </w:tc>
@@ -5873,7 +6042,7 @@
                 <w:sz w:val="17"/>
                 <w:szCs w:val="17"/>
               </w:rPr>
-              <w:t xml:space="preserve">23.533,16</w:t>
+              <w:t xml:space="preserve">26.253,69</w:t>
             </w:r>
           </w:p>
         </w:tc>
@@ -6009,7 +6178,7 @@
                 <w:sz w:val="17"/>
                 <w:szCs w:val="17"/>
               </w:rPr>
-              <w:t xml:space="preserve">125.515,50</w:t>
+              <w:t xml:space="preserve">147.124,25</w:t>
             </w:r>
           </w:p>
         </w:tc>
@@ -6042,7 +6211,7 @@
                 <w:sz w:val="17"/>
                 <w:szCs w:val="17"/>
               </w:rPr>
-              <w:t xml:space="preserve">62.351,51</w:t>
+              <w:t xml:space="preserve">69.246,96</w:t>
             </w:r>
           </w:p>
         </w:tc>
@@ -6075,7 +6244,7 @@
                 <w:sz w:val="17"/>
                 <w:szCs w:val="17"/>
               </w:rPr>
-              <w:t xml:space="preserve">38.358,26</w:t>
+              <w:t xml:space="preserve">48.045,44</w:t>
             </w:r>
           </w:p>
         </w:tc>
@@ -6140,7 +6309,7 @@
           <w:sz w:val="17"/>
           <w:szCs w:val="17"/>
         </w:rPr>
-        <w:t xml:space="preserve">Início (1–6): lançamento com clientes-piloto da lista de escritórios previdenciários da Grande SP. A base Core sobe de 4 para 16 clientes, o 1º Sprint sai no mês 4 e o 1º Scale no mês 6. Sem retirada até o mês 3, o break-even operacional chega no mês 6. Crescimento (7–12): indicações e parcerias com contadores levam a base de 19 para 31 clientes e dão ritmo à escada Core → Sprint → Scale. Estabilidade (13–24): a base vai de 34 a 56 clientes (~5% dos ~1.050 escritórios previdenciários da Grande SP), com ganho líquido de 2 clientes por mês e churn de ~3% ao mês. O Sprint passa a ser vendido também para escritórios fora da base (4 a 5 por mês).</w:t>
+        <w:t xml:space="preserve">Início (1–6): lançamento com clientes-piloto da lista de escritórios previdenciários da Grande SP. A base Core sobe de 4 para 16 clientes, o 1º Sprint sai no mês 4 e o 1º Scale no mês 6. Sem retirada até o mês 3, o break-even operacional chega no mês 6. Crescimento (7–12): indicações e parcerias com contadores levam a base de 19 para 31 clientes e dão ritmo à escada Core → Sprint → Scale. Estabilidade (13–24): a base Core vai de 36 a 79 clientes (~8% dos ~1.050 escritórios previdenciários da Grande SP). O Sprint passa a ser vendido também para escritórios fora da base (4 a 5 por mês), e quem compra vira assinante do Core depois do mês grátis. Churn de ~3% ao mês.</w:t>
       </w:r>
     </w:p>
     <w:p>
@@ -6444,7 +6613,7 @@
                 <w:sz w:val="17"/>
                 <w:szCs w:val="17"/>
               </w:rPr>
-              <w:t xml:space="preserve">R$ 126.073,61</w:t>
+              <w:t xml:space="preserve">R$ 167.855,25</w:t>
             </w:r>
           </w:p>
         </w:tc>
@@ -6477,7 +6646,7 @@
                 <w:sz w:val="17"/>
                 <w:szCs w:val="17"/>
               </w:rPr>
-              <w:t xml:space="preserve">Viável: gera R$ 124 de valor para cada R$ 100 investidos</w:t>
+              <w:t xml:space="preserve">Viável: gera R$ 165 de valor para cada R$ 100 investidos</w:t>
             </w:r>
           </w:p>
         </w:tc>
@@ -6547,7 +6716,7 @@
                 <w:sz w:val="17"/>
                 <w:szCs w:val="17"/>
               </w:rPr>
-              <w:t xml:space="preserve">104,8% a.a.</w:t>
+              <w:t xml:space="preserve">126,3% a.a.</w:t>
             </w:r>
           </w:p>
         </w:tc>
@@ -6959,7 +7128,7 @@
                 <w:sz w:val="17"/>
                 <w:szCs w:val="17"/>
               </w:rPr>
-              <w:t xml:space="preserve">R$ 125.694,44</w:t>
+              <w:t xml:space="preserve">R$ 120.917,63</w:t>
             </w:r>
           </w:p>
         </w:tc>
@@ -6992,7 +7161,7 @@
                 <w:sz w:val="17"/>
                 <w:szCs w:val="17"/>
               </w:rPr>
-              <w:t xml:space="preserve">Cabe nos R$ 150 mil, com folga de R$ 24.305,56</w:t>
+              <w:t xml:space="preserve">Cabe nos R$ 150 mil, com folga de R$ 29.082,37</w:t>
             </w:r>
           </w:p>
         </w:tc>
@@ -7062,7 +7231,7 @@
                 <w:sz w:val="17"/>
                 <w:szCs w:val="17"/>
               </w:rPr>
-              <w:t xml:space="preserve">R$ 138,3 mil / 112,2 mil / 102,1 mil</w:t>
+              <w:t xml:space="preserve">R$ 182,5 mil / 151,2 mil / 139,1 mil</w:t>
             </w:r>
           </w:p>
         </w:tc>

</xml_diff>

<commit_message>
Book Sprint and Scale at full price in the month of sale
Payment no longer follows delivery: the client pays by Pix or card and
Precept receives the full amount when the sale closes. Scale revenue is
now Scales sold x R$ 29.997 (not 6 monthly installments), and its
variable costs (specialists, commissions, R$ 1.200 of visits) are booked
with the sale. Partner pay stays at 3.5% each; break-even stays at
month 6 with every later month positive. VPL at 24% a.a. goes to
R$ 172,5 mil, TIR 131%, payback month 16.

The form now shows quantities that multiply exactly to each revenue
line (Scale as 11 / 12 per month). Planning document, pitch slides
11/12/16 and the Matriz page drop the installment wording; the Matriz
HTML is saved here because the artifact could not be republished.

Co-Authored-By: Claude Opus 5.5 <noreply@anthropic.com>
Claude-Session: https://claude.ai/code/session_016kLWp3PkVdryYcjkVkag3m
</commit_message>
<xml_diff>
--- a/precept-financeiro/Ficha_Levantamento_Financeiro_Precept.docx
+++ b/precept-financeiro/Ficha_Levantamento_Financeiro_Precept.docx
@@ -735,7 +735,7 @@
                 <w:sz w:val="17"/>
                 <w:szCs w:val="17"/>
               </w:rPr>
-              <w:t xml:space="preserve">20,17</w:t>
+              <w:t xml:space="preserve">20,16667</w:t>
             </w:r>
           </w:p>
         </w:tc>
@@ -904,7 +904,7 @@
                 <w:sz w:val="17"/>
                 <w:szCs w:val="17"/>
               </w:rPr>
-              <w:t xml:space="preserve">50,42</w:t>
+              <w:t xml:space="preserve">50,41667</w:t>
             </w:r>
           </w:p>
         </w:tc>
@@ -1007,7 +1007,7 @@
                 <w:sz w:val="17"/>
                 <w:szCs w:val="17"/>
               </w:rPr>
-              <w:t xml:space="preserve">Precept Sprint – imersão estratégica e tática de 7 dias</w:t>
+              <w:t xml:space="preserve">Precept Sprint – planejamento estratégico e tático em 7 dias</w:t>
             </w:r>
           </w:p>
         </w:tc>
@@ -1139,7 +1139,7 @@
                 <w:sz w:val="17"/>
                 <w:szCs w:val="17"/>
               </w:rPr>
-              <w:t xml:space="preserve">Preço do grupo. Vendido para a base Core e também para escritórios de fora (54 Sprints no ano 2, 4 a 5 por mês). Inclui 1 mês de Core</w:t>
+              <w:t xml:space="preserve">Preço do grupo; Pix ou cartão. Vendido à base e a escritórios de fora (54 no ano 2). Inclui 1 mês de Core</w:t>
             </w:r>
           </w:p>
         </w:tc>
@@ -1176,7 +1176,7 @@
                 <w:sz w:val="17"/>
                 <w:szCs w:val="17"/>
               </w:rPr>
-              <w:t xml:space="preserve">Precept Scale – implementação (6 parcelas de R$ 4.999,50)</w:t>
+              <w:t xml:space="preserve">Precept Scale – implementação dos 6 pilares em 6 meses</w:t>
             </w:r>
           </w:p>
         </w:tc>
@@ -1209,7 +1209,7 @@
                 <w:sz w:val="17"/>
                 <w:szCs w:val="17"/>
               </w:rPr>
-              <w:t xml:space="preserve">4.999,50</w:t>
+              <w:t xml:space="preserve">29.997,00</w:t>
             </w:r>
           </w:p>
         </w:tc>
@@ -1242,7 +1242,7 @@
                 <w:sz w:val="17"/>
                 <w:szCs w:val="17"/>
               </w:rPr>
-              <w:t xml:space="preserve">5,33</w:t>
+              <w:t xml:space="preserve">11 ÷ 12</w:t>
             </w:r>
           </w:p>
         </w:tc>
@@ -1275,7 +1275,7 @@
                 <w:sz w:val="17"/>
                 <w:szCs w:val="17"/>
               </w:rPr>
-              <w:t xml:space="preserve">26.664,00</w:t>
+              <w:t xml:space="preserve">27.497,25</w:t>
             </w:r>
           </w:p>
         </w:tc>
@@ -1308,7 +1308,7 @@
                 <w:sz w:val="17"/>
                 <w:szCs w:val="17"/>
               </w:rPr>
-              <w:t xml:space="preserve">Preço proposto: R$ 29.997 (3× o Sprint). Inclui 3 meses de Core. ~20% de quem faz o Sprint contrata (11 no ano 2)</w:t>
+              <w:t xml:space="preserve">Preço proposto (3× o Sprint); Pix ou cartão. ~20% de quem faz o Sprint contrata (11 no ano 2). Inclui 3 meses de Core</w:t>
             </w:r>
           </w:p>
         </w:tc>
@@ -1455,7 +1455,7 @@
                 <w:sz w:val="17"/>
                 <w:szCs w:val="17"/>
               </w:rPr>
-              <w:t xml:space="preserve">147.124,25</w:t>
+              <w:t xml:space="preserve">147.957,50</w:t>
             </w:r>
           </w:p>
         </w:tc>
@@ -1510,7 +1510,7 @@
           <w:sz w:val="16"/>
           <w:szCs w:val="16"/>
         </w:rPr>
-        <w:t xml:space="preserve">Mês típico com 57,7 clientes Core ativos em média, dos quais 50,4 pagantes (os demais estão no mês de Core grátis do Sprint ou do Scale), 4,5 Sprints vendidos e 5,33 parcelas de Scale recebidas por mês. Cada assinatura inclui 1 acesso master + 4 dependentes.</w:t>
+        <w:t xml:space="preserve">Mês típico: 57,7 clientes Core ativos (50,4 pagantes; os demais estão no Core grátis do Sprint ou do Scale), 4,5 Sprints e 0,92 Scale vendidos por mês. Sprint e Scale entram pelo valor cheio no mês da venda. Cada assinatura do Core inclui 1 master + 4 dependentes.</w:t>
       </w:r>
     </w:p>
     <w:p>
@@ -2053,7 +2053,7 @@
                 <w:sz w:val="17"/>
                 <w:szCs w:val="17"/>
               </w:rPr>
-              <w:t xml:space="preserve">Simples Nacional, Anexo V: 17,4% a 19,5% da venda (média de 18,8%)</w:t>
+              <w:t xml:space="preserve">Simples Nacional, Anexo V: 17,6% a 19,5% da venda (média de 18,9%)</w:t>
             </w:r>
           </w:p>
         </w:tc>
@@ -2086,7 +2086,7 @@
                 <w:sz w:val="17"/>
                 <w:szCs w:val="17"/>
               </w:rPr>
-              <w:t xml:space="preserve">27.649,61</w:t>
+              <w:t xml:space="preserve">27.903,69</w:t>
             </w:r>
           </w:p>
         </w:tc>
@@ -2189,7 +2189,7 @@
                 <w:sz w:val="17"/>
                 <w:szCs w:val="17"/>
               </w:rPr>
-              <w:t xml:space="preserve">2% da venda (Pix e boleto a R$ 1,99; cartão a 2,99% + R$ 0,49)</w:t>
+              <w:t xml:space="preserve">2% da venda (Pix e boleto a R$ 1,99; cartão a partir de 2,99% + R$ 0,49)</w:t>
             </w:r>
           </w:p>
         </w:tc>
@@ -2222,7 +2222,7 @@
                 <w:sz w:val="17"/>
                 <w:szCs w:val="17"/>
               </w:rPr>
-              <w:t xml:space="preserve">2.942,49</w:t>
+              <w:t xml:space="preserve">2.959,15</w:t>
             </w:r>
           </w:p>
         </w:tc>
@@ -2255,7 +2255,7 @@
                 <w:sz w:val="17"/>
                 <w:szCs w:val="17"/>
               </w:rPr>
-              <w:t xml:space="preserve">Tabela de taxas do Asaas (asaas.com/precos-e-taxas)</w:t>
+              <w:t xml:space="preserve">Taxas do Asaas (asaas.com/precos-e-taxas); maioria via Pix</w:t>
             </w:r>
           </w:p>
         </w:tc>
@@ -2358,7 +2358,7 @@
                 <w:sz w:val="17"/>
                 <w:szCs w:val="17"/>
               </w:rPr>
-              <w:t xml:space="preserve">3.582,53</w:t>
+              <w:t xml:space="preserve">3.624,19</w:t>
             </w:r>
           </w:p>
         </w:tc>
@@ -2461,7 +2461,7 @@
                 <w:sz w:val="17"/>
                 <w:szCs w:val="17"/>
               </w:rPr>
-              <w:t xml:space="preserve">R$ 600 por Sprint + R$ 200 por mês de Scale</w:t>
+              <w:t xml:space="preserve">R$ 600 por Sprint + R$ 1.200 por Scale (6 visitas de R$ 200)</w:t>
             </w:r>
           </w:p>
         </w:tc>
@@ -2494,7 +2494,7 @@
                 <w:sz w:val="17"/>
                 <w:szCs w:val="17"/>
               </w:rPr>
-              <w:t xml:space="preserve">3.766,67</w:t>
+              <w:t xml:space="preserve">3.800,00</w:t>
             </w:r>
           </w:p>
         </w:tc>
@@ -2597,7 +2597,7 @@
                 <w:sz w:val="17"/>
                 <w:szCs w:val="17"/>
               </w:rPr>
-              <w:t xml:space="preserve">35% da receita de Sprint + Scale</w:t>
+              <w:t xml:space="preserve">35% da receita de Sprint + Scale, lançado no mês da venda</w:t>
             </w:r>
           </w:p>
         </w:tc>
@@ -2630,7 +2630,7 @@
                 <w:sz w:val="17"/>
                 <w:szCs w:val="17"/>
               </w:rPr>
-              <w:t xml:space="preserve">25.077,68</w:t>
+              <w:t xml:space="preserve">25.369,31</w:t>
             </w:r>
           </w:p>
         </w:tc>
@@ -2774,7 +2774,7 @@
                 <w:sz w:val="17"/>
                 <w:szCs w:val="17"/>
               </w:rPr>
-              <w:t xml:space="preserve">69.246,96</w:t>
+              <w:t xml:space="preserve">69.884,34</w:t>
             </w:r>
           </w:p>
         </w:tc>
@@ -2839,7 +2839,7 @@
           <w:sz w:val="19"/>
           <w:szCs w:val="19"/>
         </w:rPr>
-        <w:t xml:space="preserve">47,1%</w:t>
+        <w:t xml:space="preserve">47,2%</w:t>
       </w:r>
     </w:p>
     <w:p>
@@ -2855,7 +2855,7 @@
           <w:sz w:val="16"/>
           <w:szCs w:val="16"/>
         </w:rPr>
-        <w:t xml:space="preserve">Esse % muda por fase, porque muda o mix (no Início quase tudo é Core, que tem custo variável menor) e a alíquota do Simples sobe com o faturamento: Início 36,5% · Crescimento 42,7% · Estabilidade 47,1%. A planilha calcula isso mês a mês.</w:t>
+        <w:t xml:space="preserve">Esse % muda por fase, porque muda o mix (no Início quase tudo é Core, que tem custo variável menor) e a alíquota do Simples sobe com o faturamento: Início 40,9% · Crescimento 44,1% · Estabilidade 47,2%. A planilha calcula isso mês a mês.</w:t>
       </w:r>
     </w:p>
     <w:p>
@@ -3295,7 +3295,7 @@
                 <w:sz w:val="17"/>
                 <w:szCs w:val="17"/>
               </w:rPr>
-              <w:t xml:space="preserve">36.045,44</w:t>
+              <w:t xml:space="preserve">36.249,59</w:t>
             </w:r>
           </w:p>
         </w:tc>
@@ -3328,7 +3328,7 @@
                 <w:sz w:val="17"/>
                 <w:szCs w:val="17"/>
               </w:rPr>
-              <w:t xml:space="preserve">7 sócios × 3,5% da receita bruta (24,5% no total), a partir do mês 4. Média de R$ 5.149 por sócio no ano 2</w:t>
+              <w:t xml:space="preserve">7 sócios × 3,5% da receita bruta (24,5% no total), a partir do mês 4. Média de R$ 5.178 por sócio no ano 2</w:t>
             </w:r>
           </w:p>
         </w:tc>
@@ -4124,7 +4124,7 @@
                 <w:sz w:val="17"/>
                 <w:szCs w:val="17"/>
               </w:rPr>
-              <w:t xml:space="preserve">48.045,44</w:t>
+              <w:t xml:space="preserve">48.249,59</w:t>
             </w:r>
           </w:p>
         </w:tc>
@@ -5774,7 +5774,7 @@
                 <w:sz w:val="17"/>
                 <w:szCs w:val="17"/>
               </w:rPr>
-              <w:t xml:space="preserve">19.803,75</w:t>
+              <w:t xml:space="preserve">23.970,00</w:t>
             </w:r>
           </w:p>
         </w:tc>
@@ -5807,7 +5807,7 @@
                 <w:sz w:val="17"/>
                 <w:szCs w:val="17"/>
               </w:rPr>
-              <w:t xml:space="preserve">7.225,91</w:t>
+              <w:t xml:space="preserve">9.798,06</w:t>
             </w:r>
           </w:p>
         </w:tc>
@@ -5840,7 +5840,7 @@
                 <w:sz w:val="17"/>
                 <w:szCs w:val="17"/>
               </w:rPr>
-              <w:t xml:space="preserve">15.690,50</w:t>
+              <w:t xml:space="preserve">16.711,23</w:t>
             </w:r>
           </w:p>
         </w:tc>
@@ -5976,7 +5976,7 @@
                 <w:sz w:val="17"/>
                 <w:szCs w:val="17"/>
               </w:rPr>
-              <w:t xml:space="preserve">58.178,33</w:t>
+              <w:t xml:space="preserve">61.511,33</w:t>
             </w:r>
           </w:p>
         </w:tc>
@@ -6009,7 +6009,7 @@
                 <w:sz w:val="17"/>
                 <w:szCs w:val="17"/>
               </w:rPr>
-              <w:t xml:space="preserve">24.858,76</w:t>
+              <w:t xml:space="preserve">27.099,90</w:t>
             </w:r>
           </w:p>
         </w:tc>
@@ -6042,7 +6042,7 @@
                 <w:sz w:val="17"/>
                 <w:szCs w:val="17"/>
               </w:rPr>
-              <w:t xml:space="preserve">26.253,69</w:t>
+              <w:t xml:space="preserve">27.070,28</w:t>
             </w:r>
           </w:p>
         </w:tc>
@@ -6178,7 +6178,7 @@
                 <w:sz w:val="17"/>
                 <w:szCs w:val="17"/>
               </w:rPr>
-              <w:t xml:space="preserve">147.124,25</w:t>
+              <w:t xml:space="preserve">147.957,50</w:t>
             </w:r>
           </w:p>
         </w:tc>
@@ -6211,7 +6211,7 @@
                 <w:sz w:val="17"/>
                 <w:szCs w:val="17"/>
               </w:rPr>
-              <w:t xml:space="preserve">69.246,96</w:t>
+              <w:t xml:space="preserve">69.884,34</w:t>
             </w:r>
           </w:p>
         </w:tc>
@@ -6244,7 +6244,7 @@
                 <w:sz w:val="17"/>
                 <w:szCs w:val="17"/>
               </w:rPr>
-              <w:t xml:space="preserve">48.045,44</w:t>
+              <w:t xml:space="preserve">48.249,59</w:t>
             </w:r>
           </w:p>
         </w:tc>
@@ -6613,7 +6613,7 @@
                 <w:sz w:val="17"/>
                 <w:szCs w:val="17"/>
               </w:rPr>
-              <w:t xml:space="preserve">R$ 167.855,25</w:t>
+              <w:t xml:space="preserve">R$ 172.527,16</w:t>
             </w:r>
           </w:p>
         </w:tc>
@@ -6646,7 +6646,7 @@
                 <w:sz w:val="17"/>
                 <w:szCs w:val="17"/>
               </w:rPr>
-              <w:t xml:space="preserve">Viável: gera R$ 165 de valor para cada R$ 100 investidos</w:t>
+              <w:t xml:space="preserve">Viável: gera R$ 169 de valor para cada R$ 100 investidos</w:t>
             </w:r>
           </w:p>
         </w:tc>
@@ -6716,7 +6716,7 @@
                 <w:sz w:val="17"/>
                 <w:szCs w:val="17"/>
               </w:rPr>
-              <w:t xml:space="preserve">126,3% a.a.</w:t>
+              <w:t xml:space="preserve">131,2% a.a.</w:t>
             </w:r>
           </w:p>
         </w:tc>
@@ -7025,7 +7025,7 @@
                 <w:sz w:val="17"/>
                 <w:szCs w:val="17"/>
               </w:rPr>
-              <w:t xml:space="preserve">Mês 17 / mês 18</w:t>
+              <w:t xml:space="preserve">Mês 16 / mês 18</w:t>
             </w:r>
           </w:p>
         </w:tc>
@@ -7128,7 +7128,7 @@
                 <w:sz w:val="17"/>
                 <w:szCs w:val="17"/>
               </w:rPr>
-              <w:t xml:space="preserve">R$ 120.917,63</w:t>
+              <w:t xml:space="preserve">R$ 120.917,64</w:t>
             </w:r>
           </w:p>
         </w:tc>
@@ -7161,7 +7161,7 @@
                 <w:sz w:val="17"/>
                 <w:szCs w:val="17"/>
               </w:rPr>
-              <w:t xml:space="preserve">Cabe nos R$ 150 mil, com folga de R$ 29.082,37</w:t>
+              <w:t xml:space="preserve">Cabe nos R$ 150 mil, com folga de R$ 29.082,36</w:t>
             </w:r>
           </w:p>
         </w:tc>
@@ -7231,7 +7231,7 @@
                 <w:sz w:val="17"/>
                 <w:szCs w:val="17"/>
               </w:rPr>
-              <w:t xml:space="preserve">R$ 182,5 mil / 151,2 mil / 139,1 mil</w:t>
+              <w:t xml:space="preserve">R$ 187,2 mil / 155,8 mil / 143,6 mil</w:t>
             </w:r>
           </w:p>
         </w:tc>

</xml_diff>

<commit_message>
Price Core at R$ 1,996, ramp sales and add market sizing
- Core now has a single price of R$ 1,996/month; extra licenses
  (R$ 300) stay in the offer but are not projected.
- New Core clients follow a ladder (3, 5, 7, 10 in months 1-4),
  then grow 5% a month (Premissas B88), with 3% monthly churn.
- Model adds R$ 1,000 acquisition cost per new client, R$ 150
  monthly support per client, ISS above the Simples sublimit and
  Lucro Presumido once RBT12 passes R$ 4.8 mi.
- Template still has only its gray cells filled; Memoria de
  Calculo gains a Mercado TAM SAM SOM sheet.
- New Precept_Pesquisa_de_Mercado (beachhead, TAM, SAM, SOM with
  pessimistic/central/optimistic ranges).
- Ficha, planning document, pitch slides 10 and 16 and the Matriz
  updated to the new numbers.

Co-Authored-By: Claude Opus 5.5 <noreply@anthropic.com>
Claude-Session: https://claude.ai/code/session_016kLWp3PkVdryYcjkVkag3m
</commit_message>
<xml_diff>
--- a/precept-financeiro/Ficha_Levantamento_Financeiro_Precept.docx
+++ b/precept-financeiro/Ficha_Levantamento_Financeiro_Precept.docx
@@ -500,7 +500,7 @@
                 <w:sz w:val="17"/>
                 <w:szCs w:val="17"/>
               </w:rPr>
-              <w:t xml:space="preserve">Precept Core – plano Essencial (assinatura mensal, 5 licenças)</w:t>
+              <w:t xml:space="preserve">Precept Core – assinatura mensal (5 licenças incluídas)</w:t>
             </w:r>
           </w:p>
         </w:tc>
@@ -533,7 +533,7 @@
                 <w:sz w:val="17"/>
                 <w:szCs w:val="17"/>
               </w:rPr>
-              <w:t xml:space="preserve">997,00</w:t>
+              <w:t xml:space="preserve">1.996,00</w:t>
             </w:r>
           </w:p>
         </w:tc>
@@ -566,7 +566,7 @@
                 <w:sz w:val="17"/>
                 <w:szCs w:val="17"/>
               </w:rPr>
-              <w:t xml:space="preserve">30,25</w:t>
+              <w:t xml:space="preserve">2.344 ÷ 12</w:t>
             </w:r>
           </w:p>
         </w:tc>
@@ -599,7 +599,7 @@
                 <w:sz w:val="17"/>
                 <w:szCs w:val="17"/>
               </w:rPr>
-              <w:t xml:space="preserve">30.159,25</w:t>
+              <w:t xml:space="preserve">389.885,33</w:t>
             </w:r>
           </w:p>
         </w:tc>
@@ -632,7 +632,7 @@
                 <w:sz w:val="17"/>
                 <w:szCs w:val="17"/>
               </w:rPr>
-              <w:t xml:space="preserve">Faixa do pitch. ADVBOX: R$ 220–1.800/mês; Astrea: R$ 209–1.249/mês (sites oficiais, out/2026)</w:t>
+              <w:t xml:space="preserve">Preço único do grupo. Clientes pagantes no ano 2 (os demais estão no Core grátis do Sprint ou do Scale). Referência: ADVBOX até R$ 1.800/mês; Astrea até R$ 1.249/mês</w:t>
             </w:r>
           </w:p>
         </w:tc>
@@ -669,7 +669,7 @@
                 <w:sz w:val="17"/>
                 <w:szCs w:val="17"/>
               </w:rPr>
-              <w:t xml:space="preserve">Precept Core – plano Avançado (operações maiores, 5 licenças)</w:t>
+              <w:t xml:space="preserve">Precept Sprint – planejamento estratégico e tático em 7 dias</w:t>
             </w:r>
           </w:p>
         </w:tc>
@@ -702,7 +702,7 @@
                 <w:sz w:val="17"/>
                 <w:szCs w:val="17"/>
               </w:rPr>
-              <w:t xml:space="preserve">1.497,00</w:t>
+              <w:t xml:space="preserve">9.997,00</w:t>
             </w:r>
           </w:p>
         </w:tc>
@@ -735,7 +735,7 @@
                 <w:sz w:val="17"/>
                 <w:szCs w:val="17"/>
               </w:rPr>
-              <w:t xml:space="preserve">20,16667</w:t>
+              <w:t xml:space="preserve">54 ÷ 12</w:t>
             </w:r>
           </w:p>
         </w:tc>
@@ -768,7 +768,7 @@
                 <w:sz w:val="17"/>
                 <w:szCs w:val="17"/>
               </w:rPr>
-              <w:t xml:space="preserve">30.189,50</w:t>
+              <w:t xml:space="preserve">44.986,50</w:t>
             </w:r>
           </w:p>
         </w:tc>
@@ -801,7 +801,7 @@
                 <w:sz w:val="17"/>
                 <w:szCs w:val="17"/>
               </w:rPr>
-              <w:t xml:space="preserve">Faixa do pitch. O preço segue o porte da operação; hipótese de 40% da base nesse plano</w:t>
+              <w:t xml:space="preserve">Preço do grupo; Pix ou cartão. 54 imersões no ano 2. Inclui 1 mês de Core</w:t>
             </w:r>
           </w:p>
         </w:tc>
@@ -838,7 +838,7 @@
                 <w:sz w:val="17"/>
                 <w:szCs w:val="17"/>
               </w:rPr>
-              <w:t xml:space="preserve">Licenças extras (acima das 5 incluídas)</w:t>
+              <w:t xml:space="preserve">Precept Scale – implementação dos 6 pilares em 6 meses</w:t>
             </w:r>
           </w:p>
         </w:tc>
@@ -871,7 +871,7 @@
                 <w:sz w:val="17"/>
                 <w:szCs w:val="17"/>
               </w:rPr>
-              <w:t xml:space="preserve">300,00</w:t>
+              <w:t xml:space="preserve">29.997,00</w:t>
             </w:r>
           </w:p>
         </w:tc>
@@ -904,7 +904,7 @@
                 <w:sz w:val="17"/>
                 <w:szCs w:val="17"/>
               </w:rPr>
-              <w:t xml:space="preserve">50,41667</w:t>
+              <w:t xml:space="preserve">11 ÷ 12</w:t>
             </w:r>
           </w:p>
         </w:tc>
@@ -937,7 +937,7 @@
                 <w:sz w:val="17"/>
                 <w:szCs w:val="17"/>
               </w:rPr>
-              <w:t xml:space="preserve">15.125,00</w:t>
+              <w:t xml:space="preserve">27.497,25</w:t>
             </w:r>
           </w:p>
         </w:tc>
@@ -970,7 +970,7 @@
                 <w:sz w:val="17"/>
                 <w:szCs w:val="17"/>
               </w:rPr>
-              <w:t xml:space="preserve">Decisão do grupo: R$ 300/mês por licença. Hipótese: 1 licença extra por cliente pagante, em média</w:t>
+              <w:t xml:space="preserve">Preço proposto (3× o Sprint); Pix ou cartão. ~20% de quem faz o Sprint contrata (11 no ano 2). Inclui 3 meses de Core</w:t>
             </w:r>
           </w:p>
         </w:tc>
@@ -988,344 +988,6 @@
               <w:bottom w:val="single" w:color="7F7F7F" w:sz="4"/>
               <w:right w:val="single" w:color="7F7F7F" w:sz="4"/>
             </w:tcBorders>
-            <w:tcMar>
-              <w:top w:type="dxa" w:w="50"/>
-              <w:left w:type="dxa" w:w="90"/>
-              <w:bottom w:type="dxa" w:w="50"/>
-              <w:right w:type="dxa" w:w="90"/>
-            </w:tcMar>
-            <w:vAlign w:val="center"/>
-          </w:tcPr>
-          <w:p>
-            <w:pPr>
-              <w:spacing w:after="0" w:before="0" w:line="240"/>
-              <w:jc w:val="left"/>
-            </w:pPr>
-            <w:r>
-              <w:rPr>
-                <w:rFonts w:ascii="Calibri" w:cs="Calibri" w:eastAsia="Calibri" w:hAnsi="Calibri"/>
-                <w:sz w:val="17"/>
-                <w:szCs w:val="17"/>
-              </w:rPr>
-              <w:t xml:space="preserve">Precept Sprint – planejamento estratégico e tático em 7 dias</w:t>
-            </w:r>
-          </w:p>
-        </w:tc>
-        <w:tc>
-          <w:tcPr>
-            <w:tcW w:type="dxa" w:w="1300"/>
-            <w:tcBorders>
-              <w:top w:val="single" w:color="7F7F7F" w:sz="4"/>
-              <w:left w:val="single" w:color="7F7F7F" w:sz="4"/>
-              <w:bottom w:val="single" w:color="7F7F7F" w:sz="4"/>
-              <w:right w:val="single" w:color="7F7F7F" w:sz="4"/>
-            </w:tcBorders>
-            <w:tcMar>
-              <w:top w:type="dxa" w:w="50"/>
-              <w:left w:type="dxa" w:w="90"/>
-              <w:bottom w:type="dxa" w:w="50"/>
-              <w:right w:type="dxa" w:w="90"/>
-            </w:tcMar>
-            <w:vAlign w:val="center"/>
-          </w:tcPr>
-          <w:p>
-            <w:pPr>
-              <w:spacing w:after="0" w:before="0" w:line="240"/>
-              <w:jc w:val="right"/>
-            </w:pPr>
-            <w:r>
-              <w:rPr>
-                <w:rFonts w:ascii="Calibri" w:cs="Calibri" w:eastAsia="Calibri" w:hAnsi="Calibri"/>
-                <w:color w:val="1F3864"/>
-                <w:sz w:val="17"/>
-                <w:szCs w:val="17"/>
-              </w:rPr>
-              <w:t xml:space="preserve">9.997,00</w:t>
-            </w:r>
-          </w:p>
-        </w:tc>
-        <w:tc>
-          <w:tcPr>
-            <w:tcW w:type="dxa" w:w="1150"/>
-            <w:tcBorders>
-              <w:top w:val="single" w:color="7F7F7F" w:sz="4"/>
-              <w:left w:val="single" w:color="7F7F7F" w:sz="4"/>
-              <w:bottom w:val="single" w:color="7F7F7F" w:sz="4"/>
-              <w:right w:val="single" w:color="7F7F7F" w:sz="4"/>
-            </w:tcBorders>
-            <w:tcMar>
-              <w:top w:type="dxa" w:w="50"/>
-              <w:left w:type="dxa" w:w="90"/>
-              <w:bottom w:type="dxa" w:w="50"/>
-              <w:right w:type="dxa" w:w="90"/>
-            </w:tcMar>
-            <w:vAlign w:val="center"/>
-          </w:tcPr>
-          <w:p>
-            <w:pPr>
-              <w:spacing w:after="0" w:before="0" w:line="240"/>
-              <w:jc w:val="right"/>
-            </w:pPr>
-            <w:r>
-              <w:rPr>
-                <w:rFonts w:ascii="Calibri" w:cs="Calibri" w:eastAsia="Calibri" w:hAnsi="Calibri"/>
-                <w:color w:val="1F3864"/>
-                <w:sz w:val="17"/>
-                <w:szCs w:val="17"/>
-              </w:rPr>
-              <w:t xml:space="preserve">4,5</w:t>
-            </w:r>
-          </w:p>
-        </w:tc>
-        <w:tc>
-          <w:tcPr>
-            <w:tcW w:type="dxa" w:w="1500"/>
-            <w:tcBorders>
-              <w:top w:val="single" w:color="7F7F7F" w:sz="4"/>
-              <w:left w:val="single" w:color="7F7F7F" w:sz="4"/>
-              <w:bottom w:val="single" w:color="7F7F7F" w:sz="4"/>
-              <w:right w:val="single" w:color="7F7F7F" w:sz="4"/>
-            </w:tcBorders>
-            <w:tcMar>
-              <w:top w:type="dxa" w:w="50"/>
-              <w:left w:type="dxa" w:w="90"/>
-              <w:bottom w:type="dxa" w:w="50"/>
-              <w:right w:type="dxa" w:w="90"/>
-            </w:tcMar>
-            <w:vAlign w:val="center"/>
-          </w:tcPr>
-          <w:p>
-            <w:pPr>
-              <w:spacing w:after="0" w:before="0" w:line="240"/>
-              <w:jc w:val="right"/>
-            </w:pPr>
-            <w:r>
-              <w:rPr>
-                <w:rFonts w:ascii="Calibri" w:cs="Calibri" w:eastAsia="Calibri" w:hAnsi="Calibri"/>
-                <w:color w:val="1F3864"/>
-                <w:sz w:val="17"/>
-                <w:szCs w:val="17"/>
-              </w:rPr>
-              <w:t xml:space="preserve">44.986,50</w:t>
-            </w:r>
-          </w:p>
-        </w:tc>
-        <w:tc>
-          <w:tcPr>
-            <w:tcW w:type="dxa" w:w="3056"/>
-            <w:tcBorders>
-              <w:top w:val="single" w:color="7F7F7F" w:sz="4"/>
-              <w:left w:val="single" w:color="7F7F7F" w:sz="4"/>
-              <w:bottom w:val="single" w:color="7F7F7F" w:sz="4"/>
-              <w:right w:val="single" w:color="7F7F7F" w:sz="4"/>
-            </w:tcBorders>
-            <w:tcMar>
-              <w:top w:type="dxa" w:w="50"/>
-              <w:left w:type="dxa" w:w="90"/>
-              <w:bottom w:type="dxa" w:w="50"/>
-              <w:right w:type="dxa" w:w="90"/>
-            </w:tcMar>
-            <w:vAlign w:val="center"/>
-          </w:tcPr>
-          <w:p>
-            <w:pPr>
-              <w:spacing w:after="0" w:before="0" w:line="240"/>
-              <w:jc w:val="left"/>
-            </w:pPr>
-            <w:r>
-              <w:rPr>
-                <w:rFonts w:ascii="Calibri" w:cs="Calibri" w:eastAsia="Calibri" w:hAnsi="Calibri"/>
-                <w:color w:val="1F3864"/>
-                <w:sz w:val="17"/>
-                <w:szCs w:val="17"/>
-              </w:rPr>
-              <w:t xml:space="preserve">Preço do grupo; Pix ou cartão. Vendido à base e a escritórios de fora (54 no ano 2). Inclui 1 mês de Core</w:t>
-            </w:r>
-          </w:p>
-        </w:tc>
-      </w:tr>
-      <w:tr>
-        <w:trPr>
-          <w:cantSplit/>
-        </w:trPr>
-        <w:tc>
-          <w:tcPr>
-            <w:tcW w:type="dxa" w:w="2900"/>
-            <w:tcBorders>
-              <w:top w:val="single" w:color="7F7F7F" w:sz="4"/>
-              <w:left w:val="single" w:color="7F7F7F" w:sz="4"/>
-              <w:bottom w:val="single" w:color="7F7F7F" w:sz="4"/>
-              <w:right w:val="single" w:color="7F7F7F" w:sz="4"/>
-            </w:tcBorders>
-            <w:tcMar>
-              <w:top w:type="dxa" w:w="50"/>
-              <w:left w:type="dxa" w:w="90"/>
-              <w:bottom w:type="dxa" w:w="50"/>
-              <w:right w:type="dxa" w:w="90"/>
-            </w:tcMar>
-            <w:vAlign w:val="center"/>
-          </w:tcPr>
-          <w:p>
-            <w:pPr>
-              <w:spacing w:after="0" w:before="0" w:line="240"/>
-              <w:jc w:val="left"/>
-            </w:pPr>
-            <w:r>
-              <w:rPr>
-                <w:rFonts w:ascii="Calibri" w:cs="Calibri" w:eastAsia="Calibri" w:hAnsi="Calibri"/>
-                <w:sz w:val="17"/>
-                <w:szCs w:val="17"/>
-              </w:rPr>
-              <w:t xml:space="preserve">Precept Scale – implementação dos 6 pilares em 6 meses</w:t>
-            </w:r>
-          </w:p>
-        </w:tc>
-        <w:tc>
-          <w:tcPr>
-            <w:tcW w:type="dxa" w:w="1300"/>
-            <w:tcBorders>
-              <w:top w:val="single" w:color="7F7F7F" w:sz="4"/>
-              <w:left w:val="single" w:color="7F7F7F" w:sz="4"/>
-              <w:bottom w:val="single" w:color="7F7F7F" w:sz="4"/>
-              <w:right w:val="single" w:color="7F7F7F" w:sz="4"/>
-            </w:tcBorders>
-            <w:tcMar>
-              <w:top w:type="dxa" w:w="50"/>
-              <w:left w:type="dxa" w:w="90"/>
-              <w:bottom w:type="dxa" w:w="50"/>
-              <w:right w:type="dxa" w:w="90"/>
-            </w:tcMar>
-            <w:vAlign w:val="center"/>
-          </w:tcPr>
-          <w:p>
-            <w:pPr>
-              <w:spacing w:after="0" w:before="0" w:line="240"/>
-              <w:jc w:val="right"/>
-            </w:pPr>
-            <w:r>
-              <w:rPr>
-                <w:rFonts w:ascii="Calibri" w:cs="Calibri" w:eastAsia="Calibri" w:hAnsi="Calibri"/>
-                <w:color w:val="1F3864"/>
-                <w:sz w:val="17"/>
-                <w:szCs w:val="17"/>
-              </w:rPr>
-              <w:t xml:space="preserve">29.997,00</w:t>
-            </w:r>
-          </w:p>
-        </w:tc>
-        <w:tc>
-          <w:tcPr>
-            <w:tcW w:type="dxa" w:w="1150"/>
-            <w:tcBorders>
-              <w:top w:val="single" w:color="7F7F7F" w:sz="4"/>
-              <w:left w:val="single" w:color="7F7F7F" w:sz="4"/>
-              <w:bottom w:val="single" w:color="7F7F7F" w:sz="4"/>
-              <w:right w:val="single" w:color="7F7F7F" w:sz="4"/>
-            </w:tcBorders>
-            <w:tcMar>
-              <w:top w:type="dxa" w:w="50"/>
-              <w:left w:type="dxa" w:w="90"/>
-              <w:bottom w:type="dxa" w:w="50"/>
-              <w:right w:type="dxa" w:w="90"/>
-            </w:tcMar>
-            <w:vAlign w:val="center"/>
-          </w:tcPr>
-          <w:p>
-            <w:pPr>
-              <w:spacing w:after="0" w:before="0" w:line="240"/>
-              <w:jc w:val="right"/>
-            </w:pPr>
-            <w:r>
-              <w:rPr>
-                <w:rFonts w:ascii="Calibri" w:cs="Calibri" w:eastAsia="Calibri" w:hAnsi="Calibri"/>
-                <w:color w:val="1F3864"/>
-                <w:sz w:val="17"/>
-                <w:szCs w:val="17"/>
-              </w:rPr>
-              <w:t xml:space="preserve">11 ÷ 12</w:t>
-            </w:r>
-          </w:p>
-        </w:tc>
-        <w:tc>
-          <w:tcPr>
-            <w:tcW w:type="dxa" w:w="1500"/>
-            <w:tcBorders>
-              <w:top w:val="single" w:color="7F7F7F" w:sz="4"/>
-              <w:left w:val="single" w:color="7F7F7F" w:sz="4"/>
-              <w:bottom w:val="single" w:color="7F7F7F" w:sz="4"/>
-              <w:right w:val="single" w:color="7F7F7F" w:sz="4"/>
-            </w:tcBorders>
-            <w:tcMar>
-              <w:top w:type="dxa" w:w="50"/>
-              <w:left w:type="dxa" w:w="90"/>
-              <w:bottom w:type="dxa" w:w="50"/>
-              <w:right w:type="dxa" w:w="90"/>
-            </w:tcMar>
-            <w:vAlign w:val="center"/>
-          </w:tcPr>
-          <w:p>
-            <w:pPr>
-              <w:spacing w:after="0" w:before="0" w:line="240"/>
-              <w:jc w:val="right"/>
-            </w:pPr>
-            <w:r>
-              <w:rPr>
-                <w:rFonts w:ascii="Calibri" w:cs="Calibri" w:eastAsia="Calibri" w:hAnsi="Calibri"/>
-                <w:color w:val="1F3864"/>
-                <w:sz w:val="17"/>
-                <w:szCs w:val="17"/>
-              </w:rPr>
-              <w:t xml:space="preserve">27.497,25</w:t>
-            </w:r>
-          </w:p>
-        </w:tc>
-        <w:tc>
-          <w:tcPr>
-            <w:tcW w:type="dxa" w:w="3056"/>
-            <w:tcBorders>
-              <w:top w:val="single" w:color="7F7F7F" w:sz="4"/>
-              <w:left w:val="single" w:color="7F7F7F" w:sz="4"/>
-              <w:bottom w:val="single" w:color="7F7F7F" w:sz="4"/>
-              <w:right w:val="single" w:color="7F7F7F" w:sz="4"/>
-            </w:tcBorders>
-            <w:tcMar>
-              <w:top w:type="dxa" w:w="50"/>
-              <w:left w:type="dxa" w:w="90"/>
-              <w:bottom w:type="dxa" w:w="50"/>
-              <w:right w:type="dxa" w:w="90"/>
-            </w:tcMar>
-            <w:vAlign w:val="center"/>
-          </w:tcPr>
-          <w:p>
-            <w:pPr>
-              <w:spacing w:after="0" w:before="0" w:line="240"/>
-              <w:jc w:val="left"/>
-            </w:pPr>
-            <w:r>
-              <w:rPr>
-                <w:rFonts w:ascii="Calibri" w:cs="Calibri" w:eastAsia="Calibri" w:hAnsi="Calibri"/>
-                <w:color w:val="1F3864"/>
-                <w:sz w:val="17"/>
-                <w:szCs w:val="17"/>
-              </w:rPr>
-              <w:t xml:space="preserve">Preço proposto (3× o Sprint); Pix ou cartão. ~20% de quem faz o Sprint contrata (11 no ano 2). Inclui 3 meses de Core</w:t>
-            </w:r>
-          </w:p>
-        </w:tc>
-      </w:tr>
-      <w:tr>
-        <w:trPr>
-          <w:cantSplit/>
-        </w:trPr>
-        <w:tc>
-          <w:tcPr>
-            <w:tcW w:type="dxa" w:w="2900"/>
-            <w:tcBorders>
-              <w:top w:val="single" w:color="7F7F7F" w:sz="4"/>
-              <w:left w:val="single" w:color="7F7F7F" w:sz="4"/>
-              <w:bottom w:val="single" w:color="7F7F7F" w:sz="4"/>
-              <w:right w:val="single" w:color="7F7F7F" w:sz="4"/>
-            </w:tcBorders>
             <w:shd w:fill="D6DCE5" w:color="auto" w:val="clear"/>
             <w:tcMar>
               <w:top w:type="dxa" w:w="50"/>
@@ -1455,7 +1117,7 @@
                 <w:sz w:val="17"/>
                 <w:szCs w:val="17"/>
               </w:rPr>
-              <w:t xml:space="preserve">147.957,50</w:t>
+              <w:t xml:space="preserve">462.369,08</w:t>
             </w:r>
           </w:p>
         </w:tc>
@@ -1510,7 +1172,7 @@
           <w:sz w:val="16"/>
           <w:szCs w:val="16"/>
         </w:rPr>
-        <w:t xml:space="preserve">Mês típico: 57,7 clientes Core ativos (50,4 pagantes; os demais estão no Core grátis do Sprint ou do Scale), 4,5 Sprints e 0,92 Scale vendidos por mês. Sprint e Scale entram pelo valor cheio no mês da venda. Cada assinatura do Core inclui 1 master + 4 dependentes.</w:t>
+        <w:t xml:space="preserve">Mês típico: 202,6 clientes Core ativos, dos quais 195,3 pagantes; 20,7 clientes novos do Core por mês (248 no ano 2), 4,5 Sprints e 0,92 Scale por mês. Licenças extras (R$ 300/mês) não entram na conta, para simplificar.</w:t>
       </w:r>
     </w:p>
     <w:p>
@@ -1781,7 +1443,7 @@
                 <w:sz w:val="17"/>
                 <w:szCs w:val="17"/>
               </w:rPr>
-              <w:t xml:space="preserve">R$ 90 por cliente ativo (57,7) + R$ 18 por licença extra</w:t>
+              <w:t xml:space="preserve">R$ 90 por cliente ativo (202,6)</w:t>
             </w:r>
           </w:p>
         </w:tc>
@@ -1814,7 +1476,7 @@
                 <w:sz w:val="17"/>
                 <w:szCs w:val="17"/>
               </w:rPr>
-              <w:t xml:space="preserve">6.228,00</w:t>
+              <w:t xml:space="preserve">18.232,50</w:t>
             </w:r>
           </w:p>
         </w:tc>
@@ -2053,7 +1715,7 @@
                 <w:sz w:val="17"/>
                 <w:szCs w:val="17"/>
               </w:rPr>
-              <w:t xml:space="preserve">Simples Nacional, Anexo V: 17,6% a 19,5% da venda (média de 18,9%)</w:t>
+              <w:t xml:space="preserve">Simples Nacional, Anexo V (19,2% a 24,2%, com ISS à parte acima de R$ 3,6 mi); Lucro Presumido no mês 24</w:t>
             </w:r>
           </w:p>
         </w:tc>
@@ -2086,7 +1748,7 @@
                 <w:sz w:val="17"/>
                 <w:szCs w:val="17"/>
               </w:rPr>
-              <w:t xml:space="preserve">27.903,69</w:t>
+              <w:t xml:space="preserve">97.881,40</w:t>
             </w:r>
           </w:p>
         </w:tc>
@@ -2119,7 +1781,7 @@
                 <w:sz w:val="17"/>
                 <w:szCs w:val="17"/>
               </w:rPr>
-              <w:t xml:space="preserve">LC 123/2006, Anexo V (SaaS e consultoria com Fator R abaixo de 28%)</w:t>
+              <w:t xml:space="preserve">LC 123/2006 (Anexo V e sublimite de R$ 3,6 mi); Lei 9.249/1995 (presunção de 32%)</w:t>
             </w:r>
           </w:p>
         </w:tc>
@@ -2222,7 +1884,7 @@
                 <w:sz w:val="17"/>
                 <w:szCs w:val="17"/>
               </w:rPr>
-              <w:t xml:space="preserve">2.959,15</w:t>
+              <w:t xml:space="preserve">9.247,38</w:t>
             </w:r>
           </w:p>
         </w:tc>
@@ -2292,7 +1954,7 @@
                 <w:sz w:val="17"/>
                 <w:szCs w:val="17"/>
               </w:rPr>
-              <w:t xml:space="preserve">Comissões de venda</w:t>
+              <w:t xml:space="preserve">Comissões de venda e aquisição de clientes</w:t>
             </w:r>
           </w:p>
         </w:tc>
@@ -2325,7 +1987,7 @@
                 <w:sz w:val="17"/>
                 <w:szCs w:val="17"/>
               </w:rPr>
-              <w:t xml:space="preserve">5% de Sprint + Scale (10% ao parceiro em ~metade das vendas)</w:t>
+              <w:t xml:space="preserve">R$ 1.000 por cliente novo do Core + 5% de Sprint e Scale</w:t>
             </w:r>
           </w:p>
         </w:tc>
@@ -2358,7 +2020,7 @@
                 <w:sz w:val="17"/>
                 <w:szCs w:val="17"/>
               </w:rPr>
-              <w:t xml:space="preserve">3.624,19</w:t>
+              <w:t xml:space="preserve">24.290,85</w:t>
             </w:r>
           </w:p>
         </w:tc>
@@ -2391,7 +2053,7 @@
                 <w:sz w:val="17"/>
                 <w:szCs w:val="17"/>
               </w:rPr>
-              <w:t xml:space="preserve">Hipótese do grupo: programa de parceiros com contadores e associações</w:t>
+              <w:t xml:space="preserve">Mídia paga e parceiros (contadores, associações): CAC de ~R$ 1.000 por escritório</w:t>
             </w:r>
           </w:p>
         </w:tc>
@@ -2597,7 +2259,7 @@
                 <w:sz w:val="17"/>
                 <w:szCs w:val="17"/>
               </w:rPr>
-              <w:t xml:space="preserve">35% da receita de Sprint + Scale, lançado no mês da venda</w:t>
+              <w:t xml:space="preserve">35% da receita de Sprint + Scale</w:t>
             </w:r>
           </w:p>
         </w:tc>
@@ -2681,6 +2343,142 @@
               <w:bottom w:val="single" w:color="7F7F7F" w:sz="4"/>
               <w:right w:val="single" w:color="7F7F7F" w:sz="4"/>
             </w:tcBorders>
+            <w:tcMar>
+              <w:top w:type="dxa" w:w="50"/>
+              <w:left w:type="dxa" w:w="90"/>
+              <w:bottom w:type="dxa" w:w="50"/>
+              <w:right w:type="dxa" w:w="90"/>
+            </w:tcMar>
+            <w:vAlign w:val="center"/>
+          </w:tcPr>
+          <w:p>
+            <w:pPr>
+              <w:spacing w:after="0" w:before="0" w:line="240"/>
+              <w:jc w:val="left"/>
+            </w:pPr>
+            <w:r>
+              <w:rPr>
+                <w:rFonts w:ascii="Calibri" w:cs="Calibri" w:eastAsia="Calibri" w:hAnsi="Calibri"/>
+                <w:sz w:val="17"/>
+                <w:szCs w:val="17"/>
+              </w:rPr>
+              <w:t xml:space="preserve">Suporte e sucesso do cliente</w:t>
+            </w:r>
+          </w:p>
+        </w:tc>
+        <w:tc>
+          <w:tcPr>
+            <w:tcW w:type="dxa" w:w="2700"/>
+            <w:tcBorders>
+              <w:top w:val="single" w:color="7F7F7F" w:sz="4"/>
+              <w:left w:val="single" w:color="7F7F7F" w:sz="4"/>
+              <w:bottom w:val="single" w:color="7F7F7F" w:sz="4"/>
+              <w:right w:val="single" w:color="7F7F7F" w:sz="4"/>
+            </w:tcBorders>
+            <w:tcMar>
+              <w:top w:type="dxa" w:w="50"/>
+              <w:left w:type="dxa" w:w="90"/>
+              <w:bottom w:type="dxa" w:w="50"/>
+              <w:right w:type="dxa" w:w="90"/>
+            </w:tcMar>
+            <w:vAlign w:val="center"/>
+          </w:tcPr>
+          <w:p>
+            <w:pPr>
+              <w:spacing w:after="0" w:before="0" w:line="240"/>
+              <w:jc w:val="left"/>
+            </w:pPr>
+            <w:r>
+              <w:rPr>
+                <w:rFonts w:ascii="Calibri" w:cs="Calibri" w:eastAsia="Calibri" w:hAnsi="Calibri"/>
+                <w:color w:val="1F3864"/>
+                <w:sz w:val="17"/>
+                <w:szCs w:val="17"/>
+              </w:rPr>
+              <w:t xml:space="preserve">R$ 150 por cliente ativo (1 analista para cada 50 escritórios)</w:t>
+            </w:r>
+          </w:p>
+        </w:tc>
+        <w:tc>
+          <w:tcPr>
+            <w:tcW w:type="dxa" w:w="1400"/>
+            <w:tcBorders>
+              <w:top w:val="single" w:color="7F7F7F" w:sz="4"/>
+              <w:left w:val="single" w:color="7F7F7F" w:sz="4"/>
+              <w:bottom w:val="single" w:color="7F7F7F" w:sz="4"/>
+              <w:right w:val="single" w:color="7F7F7F" w:sz="4"/>
+            </w:tcBorders>
+            <w:tcMar>
+              <w:top w:type="dxa" w:w="50"/>
+              <w:left w:type="dxa" w:w="90"/>
+              <w:bottom w:type="dxa" w:w="50"/>
+              <w:right w:type="dxa" w:w="90"/>
+            </w:tcMar>
+            <w:vAlign w:val="center"/>
+          </w:tcPr>
+          <w:p>
+            <w:pPr>
+              <w:spacing w:after="0" w:before="0" w:line="240"/>
+              <w:jc w:val="right"/>
+            </w:pPr>
+            <w:r>
+              <w:rPr>
+                <w:rFonts w:ascii="Calibri" w:cs="Calibri" w:eastAsia="Calibri" w:hAnsi="Calibri"/>
+                <w:color w:val="1F3864"/>
+                <w:sz w:val="17"/>
+                <w:szCs w:val="17"/>
+              </w:rPr>
+              <w:t xml:space="preserve">30.387,50</w:t>
+            </w:r>
+          </w:p>
+        </w:tc>
+        <w:tc>
+          <w:tcPr>
+            <w:tcW w:type="dxa" w:w="3306"/>
+            <w:tcBorders>
+              <w:top w:val="single" w:color="7F7F7F" w:sz="4"/>
+              <w:left w:val="single" w:color="7F7F7F" w:sz="4"/>
+              <w:bottom w:val="single" w:color="7F7F7F" w:sz="4"/>
+              <w:right w:val="single" w:color="7F7F7F" w:sz="4"/>
+            </w:tcBorders>
+            <w:tcMar>
+              <w:top w:type="dxa" w:w="50"/>
+              <w:left w:type="dxa" w:w="90"/>
+              <w:bottom w:type="dxa" w:w="50"/>
+              <w:right w:type="dxa" w:w="90"/>
+            </w:tcMar>
+            <w:vAlign w:val="center"/>
+          </w:tcPr>
+          <w:p>
+            <w:pPr>
+              <w:spacing w:after="0" w:before="0" w:line="240"/>
+              <w:jc w:val="left"/>
+            </w:pPr>
+            <w:r>
+              <w:rPr>
+                <w:rFonts w:ascii="Calibri" w:cs="Calibri" w:eastAsia="Calibri" w:hAnsi="Calibri"/>
+                <w:color w:val="1F3864"/>
+                <w:sz w:val="17"/>
+                <w:szCs w:val="17"/>
+              </w:rPr>
+              <w:t xml:space="preserve">Analista de suporte ≈ R$ 4.500 + encargos ≈ R$ 7.500/mês</w:t>
+            </w:r>
+          </w:p>
+        </w:tc>
+      </w:tr>
+      <w:tr>
+        <w:trPr>
+          <w:cantSplit/>
+        </w:trPr>
+        <w:tc>
+          <w:tcPr>
+            <w:tcW w:type="dxa" w:w="2500"/>
+            <w:tcBorders>
+              <w:top w:val="single" w:color="7F7F7F" w:sz="4"/>
+              <w:left w:val="single" w:color="7F7F7F" w:sz="4"/>
+              <w:bottom w:val="single" w:color="7F7F7F" w:sz="4"/>
+              <w:right w:val="single" w:color="7F7F7F" w:sz="4"/>
+            </w:tcBorders>
             <w:shd w:fill="D6DCE5" w:color="auto" w:val="clear"/>
             <w:tcMar>
               <w:top w:type="dxa" w:w="50"/>
@@ -2774,7 +2572,7 @@
                 <w:sz w:val="17"/>
                 <w:szCs w:val="17"/>
               </w:rPr>
-              <w:t xml:space="preserve">69.884,34</w:t>
+              <w:t xml:space="preserve">209.208,95</w:t>
             </w:r>
           </w:p>
         </w:tc>
@@ -2839,7 +2637,7 @@
           <w:sz w:val="19"/>
           <w:szCs w:val="19"/>
         </w:rPr>
-        <w:t xml:space="preserve">47,2%</w:t>
+        <w:t xml:space="preserve">45,2%</w:t>
       </w:r>
     </w:p>
     <w:p>
@@ -2855,7 +2653,7 @@
           <w:sz w:val="16"/>
           <w:szCs w:val="16"/>
         </w:rPr>
-        <w:t xml:space="preserve">Esse % muda por fase, porque muda o mix (no Início quase tudo é Core, que tem custo variável menor) e a alíquota do Simples sobe com o faturamento: Início 40,9% · Crescimento 44,1% · Estabilidade 47,2%. A planilha calcula isso mês a mês.</w:t>
+        <w:t xml:space="preserve">Esse % muda por fase: no Início pesa mais o custo de aquisição dos clientes novos; depois, pesa a alíquota de imposto, que sobe com o faturamento. Início 52,2% · Crescimento 45,1% · Estabilidade 45,2%. A planilha calcula isso mês a mês.</w:t>
       </w:r>
     </w:p>
     <w:p>
@@ -3225,7 +3023,7 @@
                 <w:sz w:val="17"/>
                 <w:szCs w:val="17"/>
               </w:rPr>
-              <w:t xml:space="preserve">Sem funcionários CLT: o desenvolvedor é contratado como PJ (linha própria abaixo)</w:t>
+              <w:t xml:space="preserve">Sem CLT fixo: o suporte cresce com a base e está nas despesas variáveis; o dev é PJ (linha abaixo)</w:t>
             </w:r>
           </w:p>
         </w:tc>
@@ -3295,7 +3093,7 @@
                 <w:sz w:val="17"/>
                 <w:szCs w:val="17"/>
               </w:rPr>
-              <w:t xml:space="preserve">36.249,59</w:t>
+              <w:t xml:space="preserve">113.280,43</w:t>
             </w:r>
           </w:p>
         </w:tc>
@@ -3328,7 +3126,7 @@
                 <w:sz w:val="17"/>
                 <w:szCs w:val="17"/>
               </w:rPr>
-              <w:t xml:space="preserve">7 sócios × 3,5% da receita bruta (24,5% no total), a partir do mês 4. Média de R$ 5.178 por sócio no ano 2</w:t>
+              <w:t xml:space="preserve">7 sócios × 3,5% da receita bruta (24,5% no total), a partir do mês 4. Média de R$ 16.182 por sócio no ano 2</w:t>
             </w:r>
           </w:p>
         </w:tc>
@@ -3431,7 +3229,7 @@
                 <w:sz w:val="17"/>
                 <w:szCs w:val="17"/>
               </w:rPr>
-              <w:t xml:space="preserve">Contabilidade online para serviços no Simples: R$ 120–400/mês (contabilidade.com, 2026)</w:t>
+              <w:t xml:space="preserve">Contabilidade online para serviços: R$ 120–400/mês (contabilidade.com, 2026)</w:t>
             </w:r>
           </w:p>
         </w:tc>
@@ -3740,7 +3538,7 @@
                 <w:sz w:val="17"/>
                 <w:szCs w:val="17"/>
               </w:rPr>
-              <w:t xml:space="preserve">Conteúdo no LinkedIn e Instagram, anúncios e eventos de associações de advogados previdenciários</w:t>
+              <w:t xml:space="preserve">Marca e conteúdo (LinkedIn, Instagram, eventos). A mídia paga por cliente novo está nas despesas variáveis</w:t>
             </w:r>
           </w:p>
         </w:tc>
@@ -4124,7 +3922,7 @@
                 <w:sz w:val="17"/>
                 <w:szCs w:val="17"/>
               </w:rPr>
-              <w:t xml:space="preserve">48.249,59</w:t>
+              <w:t xml:space="preserve">125.280,43</w:t>
             </w:r>
           </w:p>
         </w:tc>
@@ -5774,7 +5572,7 @@
                 <w:sz w:val="17"/>
                 <w:szCs w:val="17"/>
               </w:rPr>
-              <w:t xml:space="preserve">23.970,00</w:t>
+              <w:t xml:space="preserve">52.246,67</w:t>
             </w:r>
           </w:p>
         </w:tc>
@@ -5807,7 +5605,7 @@
                 <w:sz w:val="17"/>
                 <w:szCs w:val="17"/>
               </w:rPr>
-              <w:t xml:space="preserve">9.798,06</w:t>
+              <w:t xml:space="preserve">27.272,75</w:t>
             </w:r>
           </w:p>
         </w:tc>
@@ -5840,7 +5638,7 @@
                 <w:sz w:val="17"/>
                 <w:szCs w:val="17"/>
               </w:rPr>
-              <w:t xml:space="preserve">16.711,23</w:t>
+              <w:t xml:space="preserve">22.681,35</w:t>
             </w:r>
           </w:p>
         </w:tc>
@@ -5976,7 +5774,7 @@
                 <w:sz w:val="17"/>
                 <w:szCs w:val="17"/>
               </w:rPr>
-              <w:t xml:space="preserve">61.511,33</w:t>
+              <w:t xml:space="preserve">188.007,83</w:t>
             </w:r>
           </w:p>
         </w:tc>
@@ -6009,7 +5807,7 @@
                 <w:sz w:val="17"/>
                 <w:szCs w:val="17"/>
               </w:rPr>
-              <w:t xml:space="preserve">27.099,90</w:t>
+              <w:t xml:space="preserve">84.735,86</w:t>
             </w:r>
           </w:p>
         </w:tc>
@@ -6042,7 +5840,7 @@
                 <w:sz w:val="17"/>
                 <w:szCs w:val="17"/>
               </w:rPr>
-              <w:t xml:space="preserve">27.070,28</w:t>
+              <w:t xml:space="preserve">58.061,92</w:t>
             </w:r>
           </w:p>
         </w:tc>
@@ -6178,7 +5976,7 @@
                 <w:sz w:val="17"/>
                 <w:szCs w:val="17"/>
               </w:rPr>
-              <w:t xml:space="preserve">147.957,50</w:t>
+              <w:t xml:space="preserve">462.369,08</w:t>
             </w:r>
           </w:p>
         </w:tc>
@@ -6211,7 +6009,7 @@
                 <w:sz w:val="17"/>
                 <w:szCs w:val="17"/>
               </w:rPr>
-              <w:t xml:space="preserve">69.884,34</w:t>
+              <w:t xml:space="preserve">209.208,95</w:t>
             </w:r>
           </w:p>
         </w:tc>
@@ -6244,7 +6042,7 @@
                 <w:sz w:val="17"/>
                 <w:szCs w:val="17"/>
               </w:rPr>
-              <w:t xml:space="preserve">48.249,59</w:t>
+              <w:t xml:space="preserve">125.280,43</w:t>
             </w:r>
           </w:p>
         </w:tc>
@@ -6309,7 +6107,7 @@
           <w:sz w:val="17"/>
           <w:szCs w:val="17"/>
         </w:rPr>
-        <w:t xml:space="preserve">Início (1–6): lançamento com clientes-piloto da lista de escritórios previdenciários da Grande SP. A base Core sobe de 4 para 16 clientes, o 1º Sprint sai no mês 4 e o 1º Scale no mês 6. Sem retirada até o mês 3, o break-even operacional chega no mês 6. Crescimento (7–12): indicações e parcerias com contadores levam a base de 19 para 31 clientes e dão ritmo à escada Core → Sprint → Scale. Estabilidade (13–24): a base Core vai de 36 a 79 clientes (~8% dos ~1.050 escritórios previdenciários da Grande SP). O Sprint passa a ser vendido também para escritórios fora da base (4 a 5 por mês), e quem compra vira assinante do Core depois do mês grátis. Churn de ~3% ao mês.</w:t>
+        <w:t xml:space="preserve">Início (1–6): as vendas do Core começam em escada, com 3, 5, 7 e 10 clientes novos nos meses 1 a 4, e a base chega a 45 clientes no mês 6. O 1º Sprint sai no mês 4 e o 1º Scale no mês 6. O break-even chega no mês 3. Crescimento (7–12): as vendas passam a crescer 5% ao mês (de 11 para 15 clientes novos por mês) e a base vai de 56 para 111 clientes, cerca de 20% do beachhead (546 escritórios previdenciários da Grande SP). Estabilidade (13–24): de 16 para 27 clientes novos por mês; a base vai de 124 para 292 clientes, cerca de 7,5% do SAM (3.900 escritórios do perfil em SP). No ano 2, parte das vendas vem de outras áreas do direito em SP. Churn de 3% ao mês.</w:t>
       </w:r>
     </w:p>
     <w:p>
@@ -6613,7 +6411,7 @@
                 <w:sz w:val="17"/>
                 <w:szCs w:val="17"/>
               </w:rPr>
-              <w:t xml:space="preserve">R$ 172.527,16</w:t>
+              <w:t xml:space="preserve">R$ 1.220.849,22</w:t>
             </w:r>
           </w:p>
         </w:tc>
@@ -6646,7 +6444,7 @@
                 <w:sz w:val="17"/>
                 <w:szCs w:val="17"/>
               </w:rPr>
-              <w:t xml:space="preserve">Viável: gera R$ 169 de valor para cada R$ 100 investidos</w:t>
+              <w:t xml:space="preserve">Viável: gera R$ 1.197 de valor para cada R$ 100 investidos</w:t>
             </w:r>
           </w:p>
         </w:tc>
@@ -6716,7 +6514,7 @@
                 <w:sz w:val="17"/>
                 <w:szCs w:val="17"/>
               </w:rPr>
-              <w:t xml:space="preserve">131,2% a.a.</w:t>
+              <w:t xml:space="preserve">758,8% a.a.</w:t>
             </w:r>
           </w:p>
         </w:tc>
@@ -6819,7 +6617,7 @@
                 <w:sz w:val="17"/>
                 <w:szCs w:val="17"/>
               </w:rPr>
-              <w:t xml:space="preserve">Mês 6</w:t>
+              <w:t xml:space="preserve">Mês 3</w:t>
             </w:r>
           </w:p>
         </w:tc>
@@ -6852,7 +6650,7 @@
                 <w:sz w:val="17"/>
                 <w:szCs w:val="17"/>
               </w:rPr>
-              <w:t xml:space="preserve">Bate com o pitch (6 a 7 meses)</w:t>
+              <w:t xml:space="preserve">Antes do pitch (6 a 7 meses): a escada de vendas antecipa o equilíbrio</w:t>
             </w:r>
           </w:p>
         </w:tc>
@@ -7025,7 +6823,7 @@
                 <w:sz w:val="17"/>
                 <w:szCs w:val="17"/>
               </w:rPr>
-              <w:t xml:space="preserve">Mês 16 / mês 18</w:t>
+              <w:t xml:space="preserve">Mês 9 / mês 10</w:t>
             </w:r>
           </w:p>
         </w:tc>
@@ -7058,7 +6856,7 @@
                 <w:sz w:val="17"/>
                 <w:szCs w:val="17"/>
               </w:rPr>
-              <w:t xml:space="preserve">Investimento recuperado no 2º ano</w:t>
+              <w:t xml:space="preserve">Investimento recuperado no 1º ano</w:t>
             </w:r>
           </w:p>
         </w:tc>
@@ -7128,7 +6926,7 @@
                 <w:sz w:val="17"/>
                 <w:szCs w:val="17"/>
               </w:rPr>
-              <w:t xml:space="preserve">R$ 120.917,64</w:t>
+              <w:t xml:space="preserve">R$ 118.526,30</w:t>
             </w:r>
           </w:p>
         </w:tc>
@@ -7161,7 +6959,7 @@
                 <w:sz w:val="17"/>
                 <w:szCs w:val="17"/>
               </w:rPr>
-              <w:t xml:space="preserve">Cabe nos R$ 150 mil, com folga de R$ 29.082,36</w:t>
+              <w:t xml:space="preserve">Cabe nos R$ 150 mil, com folga de R$ 31.473,70</w:t>
             </w:r>
           </w:p>
         </w:tc>
@@ -7231,7 +7029,7 @@
                 <w:sz w:val="17"/>
                 <w:szCs w:val="17"/>
               </w:rPr>
-              <w:t xml:space="preserve">R$ 187,2 mil / 155,8 mil / 143,6 mil</w:t>
+              <w:t xml:space="preserve">R$ 1.286,1 mil / 1.146,5 mil / 1.092,2 mil</w:t>
             </w:r>
           </w:p>
         </w:tc>

</xml_diff>